<commit_message>
Render OHM overview (activity/measures) as a real table
In the Occupational Health Manual (MNR-000026), the source "Type of
activity / Measures applied and goals" overview was a two-column table
but had been rendered as headings + bullets. Rebuilt it as a proper
2-column table (activity | bulleted measures), matching the source.
Definitions and noise-exposure tables were already tables.

Co-Authored-By: Claude Opus 4.8 <noreply@anthropic.com>
Claude-Session: https://claude.ai/code/session_01Gkd3K8tDngLcQLDrM4dcJc
</commit_message>
<xml_diff>
--- a/New HSSE Management System 2026/06-Operations/01-000001-000000-DAN-HSE-MNR-000026__Jun_2026_REV01_Occupational_Health_Manual.docx
+++ b/New HSSE Management System 2026/06-Operations/01-000001-000000-DAN-HSE-MNR-000026__Jun_2026_REV01_Occupational_Health_Manual.docx
@@ -2565,1483 +2565,2231 @@
       </w:r>
       <w:bookmarkEnd w:id="9006"/>
     </w:p>
-    <w:p>
-      <w:pPr>
-        <w:keepNext/>
-        <w:spacing w:after="80" w:before="160"/>
-      </w:pPr>
-      <w:r>
-        <w:rPr>
-          <w:rFonts w:ascii="Tahoma" w:cs="Tahoma" w:eastAsia="Tahoma" w:hAnsi="Tahoma"/>
-          <w:b/>
-          <w:bCs/>
-          <w:color w:val="B5692B"/>
-          <w:sz w:val="20"/>
-          <w:szCs w:val="20"/>
-        </w:rPr>
-        <w:t xml:space="preserve">Orientation and planning</w:t>
-      </w:r>
-    </w:p>
-    <w:p>
-      <w:pPr>
-        <w:pStyle w:val="ListParagraph"/>
-        <w:numPr>
-          <w:ilvl w:val="0"/>
-          <w:numId w:val="2"/>
-        </w:numPr>
-        <w:spacing w:after="60" w:line="268"/>
-        <w:jc w:val="both"/>
-      </w:pPr>
-      <w:r>
-        <w:rPr>
-          <w:rFonts w:ascii="Tahoma" w:cs="Tahoma" w:eastAsia="Tahoma" w:hAnsi="Tahoma"/>
-          <w:sz w:val="20"/>
-          <w:szCs w:val="20"/>
-        </w:rPr>
-        <w:t xml:space="preserve">Analysis of the type of production to indicate the risks and problems typical of the branch or occupation in question.</w:t>
-      </w:r>
-    </w:p>
-    <w:p>
-      <w:pPr>
-        <w:pStyle w:val="ListParagraph"/>
-        <w:numPr>
-          <w:ilvl w:val="0"/>
-          <w:numId w:val="2"/>
-        </w:numPr>
-        <w:spacing w:after="60" w:line="268"/>
-        <w:jc w:val="both"/>
-      </w:pPr>
-      <w:r>
-        <w:rPr>
-          <w:rFonts w:ascii="Tahoma" w:cs="Tahoma" w:eastAsia="Tahoma" w:hAnsi="Tahoma"/>
-          <w:sz w:val="20"/>
-          <w:szCs w:val="20"/>
-        </w:rPr>
-        <w:t xml:space="preserve">Review of problems identified previously in the company.</w:t>
-      </w:r>
-    </w:p>
-    <w:p>
-      <w:pPr>
-        <w:pStyle w:val="ListParagraph"/>
-        <w:numPr>
-          <w:ilvl w:val="0"/>
-          <w:numId w:val="2"/>
-        </w:numPr>
-        <w:spacing w:after="60" w:line="268"/>
-        <w:jc w:val="both"/>
-      </w:pPr>
-      <w:r>
-        <w:rPr>
-          <w:rFonts w:ascii="Tahoma" w:cs="Tahoma" w:eastAsia="Tahoma" w:hAnsi="Tahoma"/>
-          <w:sz w:val="20"/>
-          <w:szCs w:val="20"/>
-        </w:rPr>
-        <w:t xml:space="preserve">Review of the characteristics of the workforce of the company</w:t>
-      </w:r>
-    </w:p>
-    <w:p>
-      <w:pPr>
-        <w:pStyle w:val="ListParagraph"/>
-        <w:numPr>
-          <w:ilvl w:val="0"/>
-          <w:numId w:val="2"/>
-        </w:numPr>
-        <w:spacing w:after="60" w:line="268"/>
-        <w:jc w:val="both"/>
-      </w:pPr>
-      <w:r>
-        <w:rPr>
-          <w:rFonts w:ascii="Tahoma" w:cs="Tahoma" w:eastAsia="Tahoma" w:hAnsi="Tahoma"/>
-          <w:sz w:val="20"/>
-          <w:szCs w:val="20"/>
-        </w:rPr>
-        <w:t xml:space="preserve">Review of available data on occupational diseases and accidents</w:t>
-      </w:r>
-    </w:p>
-    <w:p>
-      <w:pPr>
-        <w:pStyle w:val="ListParagraph"/>
-        <w:numPr>
-          <w:ilvl w:val="0"/>
-          <w:numId w:val="2"/>
-        </w:numPr>
-        <w:spacing w:after="60" w:line="268"/>
-        <w:jc w:val="both"/>
-      </w:pPr>
-      <w:r>
-        <w:rPr>
-          <w:rFonts w:ascii="Tahoma" w:cs="Tahoma" w:eastAsia="Tahoma" w:hAnsi="Tahoma"/>
-          <w:sz w:val="20"/>
-          <w:szCs w:val="20"/>
-        </w:rPr>
-        <w:t xml:space="preserve">Collection of data on work methods, chemical substances, and the like</w:t>
-      </w:r>
-    </w:p>
-    <w:p>
-      <w:pPr>
-        <w:pStyle w:val="ListParagraph"/>
-        <w:numPr>
-          <w:ilvl w:val="0"/>
-          <w:numId w:val="2"/>
-        </w:numPr>
-        <w:spacing w:after="60" w:line="268"/>
-        <w:jc w:val="both"/>
-      </w:pPr>
-      <w:r>
-        <w:rPr>
-          <w:rFonts w:ascii="Tahoma" w:cs="Tahoma" w:eastAsia="Tahoma" w:hAnsi="Tahoma"/>
-          <w:sz w:val="20"/>
-          <w:szCs w:val="20"/>
-        </w:rPr>
-        <w:t xml:space="preserve">Assessment of the knowledge of employers and employees about occupational health problems</w:t>
-      </w:r>
-    </w:p>
-    <w:p>
-      <w:pPr>
-        <w:pStyle w:val="ListParagraph"/>
-        <w:numPr>
-          <w:ilvl w:val="0"/>
-          <w:numId w:val="2"/>
-        </w:numPr>
-        <w:spacing w:after="60" w:line="268"/>
-        <w:jc w:val="both"/>
-      </w:pPr>
-      <w:r>
-        <w:rPr>
-          <w:rFonts w:ascii="Tahoma" w:cs="Tahoma" w:eastAsia="Tahoma" w:hAnsi="Tahoma"/>
-          <w:sz w:val="20"/>
-          <w:szCs w:val="20"/>
-        </w:rPr>
-        <w:t xml:space="preserve">Planning for changes in production systems (e.g., installation of new facilities, machinery and equipment)</w:t>
-      </w:r>
-    </w:p>
-    <w:p>
-      <w:pPr>
-        <w:keepNext/>
-        <w:spacing w:after="80" w:before="160"/>
-      </w:pPr>
-      <w:r>
-        <w:rPr>
-          <w:rFonts w:ascii="Tahoma" w:cs="Tahoma" w:eastAsia="Tahoma" w:hAnsi="Tahoma"/>
-          <w:b/>
-          <w:bCs/>
-          <w:color w:val="B5692B"/>
-          <w:sz w:val="20"/>
-          <w:szCs w:val="20"/>
-        </w:rPr>
-        <w:t xml:space="preserve">Surveillance of the work environment</w:t>
-      </w:r>
-    </w:p>
-    <w:p>
-      <w:pPr>
-        <w:pStyle w:val="ListParagraph"/>
-        <w:numPr>
-          <w:ilvl w:val="0"/>
-          <w:numId w:val="2"/>
-        </w:numPr>
-        <w:spacing w:after="60" w:line="268"/>
-        <w:jc w:val="both"/>
-      </w:pPr>
-      <w:r>
-        <w:rPr>
-          <w:rFonts w:ascii="Tahoma" w:cs="Tahoma" w:eastAsia="Tahoma" w:hAnsi="Tahoma"/>
-          <w:sz w:val="20"/>
-          <w:szCs w:val="20"/>
-        </w:rPr>
-        <w:t xml:space="preserve">Identification and evaluation of ergonomic factors that may affect workers' health. Assessment of conditions of occupational hygiene and factors, such as physical, chemical, and biological exposures that may generate risks to the health of workers. Assessment, where appropriate, of workers' exposure to adverse psychological factors and aspects of work organization.</w:t>
-      </w:r>
-    </w:p>
-    <w:p>
-      <w:pPr>
-        <w:pStyle w:val="ListParagraph"/>
-        <w:numPr>
-          <w:ilvl w:val="0"/>
-          <w:numId w:val="2"/>
-        </w:numPr>
-        <w:spacing w:after="60" w:line="268"/>
-        <w:jc w:val="both"/>
-      </w:pPr>
-      <w:r>
-        <w:rPr>
-          <w:rFonts w:ascii="Tahoma" w:cs="Tahoma" w:eastAsia="Tahoma" w:hAnsi="Tahoma"/>
-          <w:sz w:val="20"/>
-          <w:szCs w:val="20"/>
-        </w:rPr>
-        <w:t xml:space="preserve">Risk assessment of occupational accidents and major hazards</w:t>
-      </w:r>
-    </w:p>
-    <w:p>
-      <w:pPr>
-        <w:pStyle w:val="ListParagraph"/>
-        <w:numPr>
-          <w:ilvl w:val="0"/>
-          <w:numId w:val="2"/>
-        </w:numPr>
-        <w:spacing w:after="60" w:line="268"/>
-        <w:jc w:val="both"/>
-      </w:pPr>
-      <w:r>
-        <w:rPr>
-          <w:rFonts w:ascii="Tahoma" w:cs="Tahoma" w:eastAsia="Tahoma" w:hAnsi="Tahoma"/>
-          <w:sz w:val="20"/>
-          <w:szCs w:val="20"/>
-        </w:rPr>
-        <w:t xml:space="preserve">Assessment of collective and personal protective equipment</w:t>
-      </w:r>
-    </w:p>
-    <w:p>
-      <w:pPr>
-        <w:pStyle w:val="ListParagraph"/>
-        <w:numPr>
-          <w:ilvl w:val="0"/>
-          <w:numId w:val="2"/>
-        </w:numPr>
-        <w:spacing w:after="60" w:line="268"/>
-        <w:jc w:val="both"/>
-      </w:pPr>
-      <w:r>
-        <w:rPr>
-          <w:rFonts w:ascii="Tahoma" w:cs="Tahoma" w:eastAsia="Tahoma" w:hAnsi="Tahoma"/>
-          <w:sz w:val="20"/>
-          <w:szCs w:val="20"/>
-        </w:rPr>
-        <w:t xml:space="preserve">Assessment of control systems designed to eliminate, prevent, or reduce exposure Assessment of general hygiene and sanitary facilities</w:t>
-      </w:r>
-    </w:p>
-    <w:p>
-      <w:pPr>
-        <w:keepNext/>
-        <w:spacing w:after="80" w:before="160"/>
-      </w:pPr>
-      <w:r>
-        <w:rPr>
-          <w:rFonts w:ascii="Tahoma" w:cs="Tahoma" w:eastAsia="Tahoma" w:hAnsi="Tahoma"/>
-          <w:b/>
-          <w:bCs/>
-          <w:color w:val="B5692B"/>
-          <w:sz w:val="20"/>
-          <w:szCs w:val="20"/>
-        </w:rPr>
-        <w:t xml:space="preserve">Surveillance of worker's health</w:t>
-      </w:r>
-    </w:p>
-    <w:p>
-      <w:pPr>
-        <w:pStyle w:val="ListParagraph"/>
-        <w:numPr>
-          <w:ilvl w:val="0"/>
-          <w:numId w:val="2"/>
-        </w:numPr>
-        <w:spacing w:after="60" w:line="268"/>
-        <w:jc w:val="both"/>
-      </w:pPr>
-      <w:r>
-        <w:rPr>
-          <w:rFonts w:ascii="Tahoma" w:cs="Tahoma" w:eastAsia="Tahoma" w:hAnsi="Tahoma"/>
-          <w:sz w:val="20"/>
-          <w:szCs w:val="20"/>
-        </w:rPr>
-        <w:t xml:space="preserve">Pre-assignment (pre-employment) health examinations.</w:t>
-      </w:r>
-    </w:p>
-    <w:p>
-      <w:pPr>
-        <w:pStyle w:val="ListParagraph"/>
-        <w:numPr>
-          <w:ilvl w:val="0"/>
-          <w:numId w:val="2"/>
-        </w:numPr>
-        <w:spacing w:after="60" w:line="268"/>
-        <w:jc w:val="both"/>
-      </w:pPr>
-      <w:r>
-        <w:rPr>
-          <w:rFonts w:ascii="Tahoma" w:cs="Tahoma" w:eastAsia="Tahoma" w:hAnsi="Tahoma"/>
-          <w:sz w:val="20"/>
-          <w:szCs w:val="20"/>
-        </w:rPr>
-        <w:t xml:space="preserve">Periodic health examinations.</w:t>
-      </w:r>
-    </w:p>
-    <w:p>
-      <w:pPr>
-        <w:pStyle w:val="ListParagraph"/>
-        <w:numPr>
-          <w:ilvl w:val="0"/>
-          <w:numId w:val="2"/>
-        </w:numPr>
-        <w:spacing w:after="60" w:line="268"/>
-        <w:jc w:val="both"/>
-      </w:pPr>
-      <w:r>
-        <w:rPr>
-          <w:rFonts w:ascii="Tahoma" w:cs="Tahoma" w:eastAsia="Tahoma" w:hAnsi="Tahoma"/>
-          <w:sz w:val="20"/>
-          <w:szCs w:val="20"/>
-        </w:rPr>
-        <w:t xml:space="preserve">Return-to-work health examinations.</w:t>
-      </w:r>
-    </w:p>
-    <w:p>
-      <w:pPr>
-        <w:pStyle w:val="ListParagraph"/>
-        <w:numPr>
-          <w:ilvl w:val="0"/>
-          <w:numId w:val="2"/>
-        </w:numPr>
-        <w:spacing w:after="60" w:line="268"/>
-        <w:jc w:val="both"/>
-      </w:pPr>
-      <w:r>
-        <w:rPr>
-          <w:rFonts w:ascii="Tahoma" w:cs="Tahoma" w:eastAsia="Tahoma" w:hAnsi="Tahoma"/>
-          <w:sz w:val="20"/>
-          <w:szCs w:val="20"/>
-        </w:rPr>
-        <w:t xml:space="preserve">General health examinations.</w:t>
-      </w:r>
-    </w:p>
-    <w:p>
-      <w:pPr>
-        <w:pStyle w:val="ListParagraph"/>
-        <w:numPr>
-          <w:ilvl w:val="0"/>
-          <w:numId w:val="2"/>
-        </w:numPr>
-        <w:spacing w:after="60" w:line="268"/>
-        <w:jc w:val="both"/>
-      </w:pPr>
-      <w:r>
-        <w:rPr>
-          <w:rFonts w:ascii="Tahoma" w:cs="Tahoma" w:eastAsia="Tahoma" w:hAnsi="Tahoma"/>
-          <w:sz w:val="20"/>
-          <w:szCs w:val="20"/>
-        </w:rPr>
-        <w:t xml:space="preserve">Health examinations at termination or after ending of service</w:t>
-      </w:r>
-    </w:p>
-    <w:p>
-      <w:pPr>
-        <w:keepNext/>
-        <w:spacing w:after="80" w:before="160"/>
-      </w:pPr>
-      <w:r>
-        <w:rPr>
-          <w:rFonts w:ascii="Tahoma" w:cs="Tahoma" w:eastAsia="Tahoma" w:hAnsi="Tahoma"/>
-          <w:b/>
-          <w:bCs/>
-          <w:color w:val="B5692B"/>
-          <w:sz w:val="20"/>
-          <w:szCs w:val="20"/>
-        </w:rPr>
-        <w:t xml:space="preserve">Assessment of health and safety risks</w:t>
-      </w:r>
-    </w:p>
-    <w:p>
-      <w:pPr>
-        <w:pStyle w:val="ListParagraph"/>
-        <w:numPr>
-          <w:ilvl w:val="0"/>
-          <w:numId w:val="2"/>
-        </w:numPr>
-        <w:spacing w:after="60" w:line="268"/>
-        <w:jc w:val="both"/>
-      </w:pPr>
-      <w:r>
-        <w:rPr>
-          <w:rFonts w:ascii="Tahoma" w:cs="Tahoma" w:eastAsia="Tahoma" w:hAnsi="Tahoma"/>
-          <w:sz w:val="20"/>
-          <w:szCs w:val="20"/>
-        </w:rPr>
-        <w:t xml:space="preserve">Identification of occupational health hazards (as a result of surveillances) Identification of workers or groups of workers exposed to specific hazards.</w:t>
-      </w:r>
-    </w:p>
-    <w:p>
-      <w:pPr>
-        <w:pStyle w:val="ListParagraph"/>
-        <w:numPr>
-          <w:ilvl w:val="0"/>
-          <w:numId w:val="2"/>
-        </w:numPr>
-        <w:spacing w:after="60" w:line="268"/>
-        <w:jc w:val="both"/>
-      </w:pPr>
-      <w:r>
-        <w:rPr>
-          <w:rFonts w:ascii="Tahoma" w:cs="Tahoma" w:eastAsia="Tahoma" w:hAnsi="Tahoma"/>
-          <w:sz w:val="20"/>
-          <w:szCs w:val="20"/>
-        </w:rPr>
-        <w:t xml:space="preserve">Analysis of the effects of a hazard on workers (ways of entry, type of exposure, threshold limit values, dose-response relationships, adverse health effects, etc).</w:t>
-      </w:r>
-    </w:p>
-    <w:p>
-      <w:pPr>
-        <w:pStyle w:val="ListParagraph"/>
-        <w:numPr>
-          <w:ilvl w:val="0"/>
-          <w:numId w:val="2"/>
-        </w:numPr>
-        <w:spacing w:after="60" w:line="268"/>
-        <w:jc w:val="both"/>
-      </w:pPr>
-      <w:r>
-        <w:rPr>
-          <w:rFonts w:ascii="Tahoma" w:cs="Tahoma" w:eastAsia="Tahoma" w:hAnsi="Tahoma"/>
-          <w:sz w:val="20"/>
-          <w:szCs w:val="20"/>
-        </w:rPr>
-        <w:t xml:space="preserve">Determination of intensity (level) and magnitude (volume) of risk.</w:t>
-      </w:r>
-    </w:p>
-    <w:p>
-      <w:pPr>
-        <w:pStyle w:val="ListParagraph"/>
-        <w:numPr>
-          <w:ilvl w:val="0"/>
-          <w:numId w:val="2"/>
-        </w:numPr>
-        <w:spacing w:after="60" w:line="268"/>
-        <w:jc w:val="both"/>
-      </w:pPr>
-      <w:r>
-        <w:rPr>
-          <w:rFonts w:ascii="Tahoma" w:cs="Tahoma" w:eastAsia="Tahoma" w:hAnsi="Tahoma"/>
-          <w:sz w:val="20"/>
-          <w:szCs w:val="20"/>
-        </w:rPr>
-        <w:t xml:space="preserve">Identification of workers and groups with special vulnerabilities.</w:t>
-      </w:r>
-    </w:p>
-    <w:p>
-      <w:pPr>
-        <w:pStyle w:val="ListParagraph"/>
-        <w:numPr>
-          <w:ilvl w:val="0"/>
-          <w:numId w:val="2"/>
-        </w:numPr>
-        <w:spacing w:after="60" w:line="268"/>
-        <w:jc w:val="both"/>
-      </w:pPr>
-      <w:r>
-        <w:rPr>
-          <w:rFonts w:ascii="Tahoma" w:cs="Tahoma" w:eastAsia="Tahoma" w:hAnsi="Tahoma"/>
-          <w:sz w:val="20"/>
-          <w:szCs w:val="20"/>
-        </w:rPr>
-        <w:t xml:space="preserve">Evaluation of available hazard prevention and control measures.</w:t>
-      </w:r>
-    </w:p>
-    <w:p>
-      <w:pPr>
-        <w:pStyle w:val="ListParagraph"/>
-        <w:numPr>
-          <w:ilvl w:val="0"/>
-          <w:numId w:val="2"/>
-        </w:numPr>
-        <w:spacing w:after="60" w:line="268"/>
-        <w:jc w:val="both"/>
-      </w:pPr>
-      <w:r>
-        <w:rPr>
-          <w:rFonts w:ascii="Tahoma" w:cs="Tahoma" w:eastAsia="Tahoma" w:hAnsi="Tahoma"/>
-          <w:sz w:val="20"/>
-          <w:szCs w:val="20"/>
-        </w:rPr>
-        <w:t xml:space="preserve">Drawing conclusions about and making recommendations for the management and control of risks.</w:t>
-      </w:r>
-    </w:p>
-    <w:p>
-      <w:pPr>
-        <w:pStyle w:val="ListParagraph"/>
-        <w:numPr>
-          <w:ilvl w:val="0"/>
-          <w:numId w:val="2"/>
-        </w:numPr>
-        <w:spacing w:after="60" w:line="268"/>
-        <w:jc w:val="both"/>
-      </w:pPr>
-      <w:r>
-        <w:rPr>
-          <w:rFonts w:ascii="Tahoma" w:cs="Tahoma" w:eastAsia="Tahoma" w:hAnsi="Tahoma"/>
-          <w:sz w:val="20"/>
-          <w:szCs w:val="20"/>
-        </w:rPr>
-        <w:t xml:space="preserve">Documentation of the findings of the assessment.</w:t>
-      </w:r>
-    </w:p>
-    <w:p>
-      <w:pPr>
-        <w:pStyle w:val="ListParagraph"/>
-        <w:numPr>
-          <w:ilvl w:val="0"/>
-          <w:numId w:val="2"/>
-        </w:numPr>
-        <w:spacing w:after="60" w:line="268"/>
-        <w:jc w:val="both"/>
-      </w:pPr>
-      <w:r>
-        <w:rPr>
-          <w:rFonts w:ascii="Tahoma" w:cs="Tahoma" w:eastAsia="Tahoma" w:hAnsi="Tahoma"/>
-          <w:sz w:val="20"/>
-          <w:szCs w:val="20"/>
-        </w:rPr>
-        <w:t xml:space="preserve">Periodic review and, if necessary, reassessment of risks.</w:t>
-      </w:r>
-    </w:p>
-    <w:p>
-      <w:pPr>
-        <w:pStyle w:val="ListParagraph"/>
-        <w:numPr>
-          <w:ilvl w:val="0"/>
-          <w:numId w:val="2"/>
-        </w:numPr>
-        <w:spacing w:after="60" w:line="268"/>
-        <w:jc w:val="both"/>
-      </w:pPr>
-      <w:r>
-        <w:rPr>
-          <w:rFonts w:ascii="Tahoma" w:cs="Tahoma" w:eastAsia="Tahoma" w:hAnsi="Tahoma"/>
-          <w:sz w:val="20"/>
-          <w:szCs w:val="20"/>
-        </w:rPr>
-        <w:t xml:space="preserve">Documentation of the results of risk assessments</w:t>
-      </w:r>
-    </w:p>
-    <w:p>
-      <w:pPr>
-        <w:keepNext/>
-        <w:spacing w:after="80" w:before="160"/>
-      </w:pPr>
-      <w:r>
-        <w:rPr>
-          <w:rFonts w:ascii="Tahoma" w:cs="Tahoma" w:eastAsia="Tahoma" w:hAnsi="Tahoma"/>
-          <w:b/>
-          <w:bCs/>
-          <w:color w:val="B5692B"/>
-          <w:sz w:val="20"/>
-          <w:szCs w:val="20"/>
-        </w:rPr>
-        <w:t xml:space="preserve">Information and education on risks and advice on need for preventive and control actions</w:t>
-      </w:r>
-    </w:p>
-    <w:p>
-      <w:pPr>
-        <w:pStyle w:val="ListParagraph"/>
-        <w:numPr>
-          <w:ilvl w:val="0"/>
-          <w:numId w:val="2"/>
-        </w:numPr>
-        <w:spacing w:after="60" w:line="268"/>
-        <w:jc w:val="both"/>
-      </w:pPr>
-      <w:r>
-        <w:rPr>
-          <w:rFonts w:ascii="Tahoma" w:cs="Tahoma" w:eastAsia="Tahoma" w:hAnsi="Tahoma"/>
-          <w:sz w:val="20"/>
-          <w:szCs w:val="20"/>
-        </w:rPr>
-        <w:t xml:space="preserve">Ensuring that employers and self-employed persons are aware of their obligation to know the hazards of the workplace and works in question.</w:t>
-      </w:r>
-    </w:p>
-    <w:p>
-      <w:pPr>
-        <w:pStyle w:val="ListParagraph"/>
-        <w:numPr>
-          <w:ilvl w:val="0"/>
-          <w:numId w:val="2"/>
-        </w:numPr>
-        <w:spacing w:after="60" w:line="268"/>
-        <w:jc w:val="both"/>
-      </w:pPr>
-      <w:r>
-        <w:rPr>
-          <w:rFonts w:ascii="Tahoma" w:cs="Tahoma" w:eastAsia="Tahoma" w:hAnsi="Tahoma"/>
-          <w:sz w:val="20"/>
-          <w:szCs w:val="20"/>
-        </w:rPr>
-        <w:t xml:space="preserve">Provision of information so that that workers are aware of their right to know about and continuously receive information on hazards related to their own work and the workplace.</w:t>
-      </w:r>
-    </w:p>
-    <w:p>
-      <w:pPr>
-        <w:pStyle w:val="ListParagraph"/>
-        <w:numPr>
-          <w:ilvl w:val="0"/>
-          <w:numId w:val="2"/>
-        </w:numPr>
-        <w:spacing w:after="60" w:line="268"/>
-        <w:jc w:val="both"/>
-      </w:pPr>
-      <w:r>
-        <w:rPr>
-          <w:rFonts w:ascii="Tahoma" w:cs="Tahoma" w:eastAsia="Tahoma" w:hAnsi="Tahoma"/>
-          <w:sz w:val="20"/>
-          <w:szCs w:val="20"/>
-        </w:rPr>
-        <w:t xml:space="preserve">Ensuring that employers are aware of their responsibility to train workers in safe and healthy work practices.</w:t>
-      </w:r>
-    </w:p>
-    <w:p>
-      <w:pPr>
-        <w:pStyle w:val="ListParagraph"/>
-        <w:numPr>
-          <w:ilvl w:val="0"/>
-          <w:numId w:val="2"/>
-        </w:numPr>
-        <w:spacing w:after="60" w:line="268"/>
-        <w:jc w:val="both"/>
-      </w:pPr>
-      <w:r>
-        <w:rPr>
-          <w:rFonts w:ascii="Tahoma" w:cs="Tahoma" w:eastAsia="Tahoma" w:hAnsi="Tahoma"/>
-          <w:sz w:val="20"/>
-          <w:szCs w:val="20"/>
-        </w:rPr>
-        <w:t xml:space="preserve">Ensuring that workers are aware of their duty to follow safety instructions and safe and healthy work practices.</w:t>
-      </w:r>
-    </w:p>
-    <w:p>
-      <w:pPr>
-        <w:pStyle w:val="ListParagraph"/>
-        <w:numPr>
-          <w:ilvl w:val="0"/>
-          <w:numId w:val="2"/>
-        </w:numPr>
-        <w:spacing w:after="60" w:line="268"/>
-        <w:jc w:val="both"/>
-      </w:pPr>
-      <w:r>
-        <w:rPr>
-          <w:rFonts w:ascii="Tahoma" w:cs="Tahoma" w:eastAsia="Tahoma" w:hAnsi="Tahoma"/>
-          <w:sz w:val="20"/>
-          <w:szCs w:val="20"/>
-        </w:rPr>
-        <w:t xml:space="preserve">Ensuring that special legislation is followed with respect to confidential health information on individual workers and informed consent.</w:t>
-      </w:r>
-    </w:p>
-    <w:p>
-      <w:pPr>
-        <w:pStyle w:val="ListParagraph"/>
-        <w:numPr>
-          <w:ilvl w:val="0"/>
-          <w:numId w:val="2"/>
-        </w:numPr>
-        <w:spacing w:after="60" w:line="268"/>
-        <w:jc w:val="both"/>
-      </w:pPr>
-      <w:r>
-        <w:rPr>
-          <w:rFonts w:ascii="Tahoma" w:cs="Tahoma" w:eastAsia="Tahoma" w:hAnsi="Tahoma"/>
-          <w:sz w:val="20"/>
-          <w:szCs w:val="20"/>
-        </w:rPr>
-        <w:t xml:space="preserve">Ensuring that advice provided by occupational health personnel is given in a form easily understood by employers and workers.</w:t>
-      </w:r>
-    </w:p>
-    <w:p>
-      <w:pPr>
-        <w:keepNext/>
-        <w:spacing w:after="80" w:before="160"/>
-      </w:pPr>
-      <w:r>
-        <w:rPr>
-          <w:rFonts w:ascii="Tahoma" w:cs="Tahoma" w:eastAsia="Tahoma" w:hAnsi="Tahoma"/>
-          <w:b/>
-          <w:bCs/>
-          <w:color w:val="B5692B"/>
-          <w:sz w:val="20"/>
-          <w:szCs w:val="20"/>
-        </w:rPr>
-        <w:t xml:space="preserve">Preventive actions for the management and control of health and safety hazards and risks</w:t>
-      </w:r>
-    </w:p>
-    <w:p>
-      <w:pPr>
-        <w:pStyle w:val="ListParagraph"/>
-        <w:numPr>
-          <w:ilvl w:val="0"/>
-          <w:numId w:val="2"/>
-        </w:numPr>
-        <w:spacing w:after="60" w:line="268"/>
-        <w:jc w:val="both"/>
-      </w:pPr>
-      <w:r>
-        <w:rPr>
-          <w:rFonts w:ascii="Tahoma" w:cs="Tahoma" w:eastAsia="Tahoma" w:hAnsi="Tahoma"/>
-          <w:sz w:val="20"/>
-          <w:szCs w:val="20"/>
-        </w:rPr>
-        <w:t xml:space="preserve">Control of hazards at the source</w:t>
-      </w:r>
-    </w:p>
-    <w:p>
-      <w:pPr>
-        <w:pStyle w:val="ListParagraph"/>
-        <w:numPr>
-          <w:ilvl w:val="0"/>
-          <w:numId w:val="2"/>
-        </w:numPr>
-        <w:spacing w:after="60" w:line="268"/>
-        <w:jc w:val="both"/>
-      </w:pPr>
-      <w:r>
-        <w:rPr>
-          <w:rFonts w:ascii="Tahoma" w:cs="Tahoma" w:eastAsia="Tahoma" w:hAnsi="Tahoma"/>
-          <w:sz w:val="20"/>
-          <w:szCs w:val="20"/>
-        </w:rPr>
-        <w:t xml:space="preserve">Ventilation or control technology</w:t>
-      </w:r>
-    </w:p>
-    <w:p>
-      <w:pPr>
-        <w:pStyle w:val="ListParagraph"/>
-        <w:numPr>
-          <w:ilvl w:val="0"/>
-          <w:numId w:val="2"/>
-        </w:numPr>
-        <w:spacing w:after="60" w:line="268"/>
-        <w:jc w:val="both"/>
-      </w:pPr>
-      <w:r>
-        <w:rPr>
-          <w:rFonts w:ascii="Tahoma" w:cs="Tahoma" w:eastAsia="Tahoma" w:hAnsi="Tahoma"/>
-          <w:sz w:val="20"/>
-          <w:szCs w:val="20"/>
-        </w:rPr>
-        <w:t xml:space="preserve">Dust control, Ergonomic measures.</w:t>
-      </w:r>
-    </w:p>
-    <w:p>
-      <w:pPr>
-        <w:pStyle w:val="ListParagraph"/>
-        <w:numPr>
-          <w:ilvl w:val="0"/>
-          <w:numId w:val="2"/>
-        </w:numPr>
-        <w:spacing w:after="60" w:line="268"/>
-        <w:jc w:val="both"/>
-      </w:pPr>
-      <w:r>
-        <w:rPr>
-          <w:rFonts w:ascii="Tahoma" w:cs="Tahoma" w:eastAsia="Tahoma" w:hAnsi="Tahoma"/>
-          <w:sz w:val="20"/>
-          <w:szCs w:val="20"/>
-        </w:rPr>
-        <w:t xml:space="preserve">Use of personal protective equipment</w:t>
-      </w:r>
-    </w:p>
-    <w:p>
-      <w:pPr>
-        <w:pStyle w:val="ListParagraph"/>
-        <w:numPr>
-          <w:ilvl w:val="0"/>
-          <w:numId w:val="2"/>
-        </w:numPr>
-        <w:spacing w:after="60" w:line="268"/>
-        <w:jc w:val="both"/>
-      </w:pPr>
-      <w:r>
-        <w:rPr>
-          <w:rFonts w:ascii="Tahoma" w:cs="Tahoma" w:eastAsia="Tahoma" w:hAnsi="Tahoma"/>
-          <w:sz w:val="20"/>
-          <w:szCs w:val="20"/>
-        </w:rPr>
-        <w:t xml:space="preserve">Regulation of thermal conditions and the like</w:t>
-      </w:r>
-    </w:p>
-    <w:p>
-      <w:pPr>
-        <w:keepNext/>
-        <w:spacing w:after="80" w:before="160"/>
-      </w:pPr>
-      <w:r>
-        <w:rPr>
-          <w:rFonts w:ascii="Tahoma" w:cs="Tahoma" w:eastAsia="Tahoma" w:hAnsi="Tahoma"/>
-          <w:b/>
-          <w:bCs/>
-          <w:color w:val="B5692B"/>
-          <w:sz w:val="20"/>
-          <w:szCs w:val="20"/>
-        </w:rPr>
-        <w:t xml:space="preserve">Prevention of accidents</w:t>
-      </w:r>
-    </w:p>
-    <w:p>
-      <w:pPr>
-        <w:pStyle w:val="ListParagraph"/>
-        <w:numPr>
-          <w:ilvl w:val="0"/>
-          <w:numId w:val="2"/>
-        </w:numPr>
-        <w:spacing w:after="60" w:line="268"/>
-        <w:jc w:val="both"/>
-      </w:pPr>
-      <w:r>
-        <w:rPr>
-          <w:rFonts w:ascii="Tahoma" w:cs="Tahoma" w:eastAsia="Tahoma" w:hAnsi="Tahoma"/>
-          <w:sz w:val="20"/>
-          <w:szCs w:val="20"/>
-        </w:rPr>
-        <w:t xml:space="preserve">Safe planning of facilities, machinery, and the like</w:t>
-      </w:r>
-    </w:p>
-    <w:p>
-      <w:pPr>
-        <w:pStyle w:val="ListParagraph"/>
-        <w:numPr>
-          <w:ilvl w:val="0"/>
-          <w:numId w:val="2"/>
-        </w:numPr>
-        <w:spacing w:after="60" w:line="268"/>
-        <w:jc w:val="both"/>
-      </w:pPr>
-      <w:r>
-        <w:rPr>
-          <w:rFonts w:ascii="Tahoma" w:cs="Tahoma" w:eastAsia="Tahoma" w:hAnsi="Tahoma"/>
-          <w:sz w:val="20"/>
-          <w:szCs w:val="20"/>
-        </w:rPr>
-        <w:t xml:space="preserve">Good housekeeping, order, and cleanliness</w:t>
-      </w:r>
-    </w:p>
-    <w:p>
-      <w:pPr>
-        <w:pStyle w:val="ListParagraph"/>
-        <w:numPr>
-          <w:ilvl w:val="0"/>
-          <w:numId w:val="2"/>
-        </w:numPr>
-        <w:spacing w:after="60" w:line="268"/>
-        <w:jc w:val="both"/>
-      </w:pPr>
-      <w:r>
-        <w:rPr>
-          <w:rFonts w:ascii="Tahoma" w:cs="Tahoma" w:eastAsia="Tahoma" w:hAnsi="Tahoma"/>
-          <w:sz w:val="20"/>
-          <w:szCs w:val="20"/>
-        </w:rPr>
-        <w:t xml:space="preserve">Construction of walkways and other structures safe (eg, scaffolds, fences) Guarding dangerous machines</w:t>
-      </w:r>
-    </w:p>
-    <w:p>
-      <w:pPr>
-        <w:pStyle w:val="ListParagraph"/>
-        <w:numPr>
-          <w:ilvl w:val="0"/>
-          <w:numId w:val="2"/>
-        </w:numPr>
-        <w:spacing w:after="60" w:line="268"/>
-        <w:jc w:val="both"/>
-      </w:pPr>
-      <w:r>
-        <w:rPr>
-          <w:rFonts w:ascii="Tahoma" w:cs="Tahoma" w:eastAsia="Tahoma" w:hAnsi="Tahoma"/>
-          <w:sz w:val="20"/>
-          <w:szCs w:val="20"/>
-        </w:rPr>
-        <w:t xml:space="preserve">Technical aids for moving and lifting heavy loads.</w:t>
-      </w:r>
-    </w:p>
-    <w:p>
-      <w:pPr>
-        <w:pStyle w:val="ListParagraph"/>
-        <w:numPr>
-          <w:ilvl w:val="0"/>
-          <w:numId w:val="2"/>
-        </w:numPr>
-        <w:spacing w:after="60" w:line="268"/>
-        <w:jc w:val="both"/>
-      </w:pPr>
-      <w:r>
-        <w:rPr>
-          <w:rFonts w:ascii="Tahoma" w:cs="Tahoma" w:eastAsia="Tahoma" w:hAnsi="Tahoma"/>
-          <w:sz w:val="20"/>
-          <w:szCs w:val="20"/>
-        </w:rPr>
-        <w:t xml:space="preserve">Safe tools and safety equipment for workers</w:t>
-      </w:r>
-    </w:p>
-    <w:p>
-      <w:pPr>
-        <w:pStyle w:val="ListParagraph"/>
-        <w:numPr>
-          <w:ilvl w:val="0"/>
-          <w:numId w:val="2"/>
-        </w:numPr>
-        <w:spacing w:after="60" w:line="268"/>
-        <w:jc w:val="both"/>
-      </w:pPr>
-      <w:r>
-        <w:rPr>
-          <w:rFonts w:ascii="Tahoma" w:cs="Tahoma" w:eastAsia="Tahoma" w:hAnsi="Tahoma"/>
-          <w:sz w:val="20"/>
-          <w:szCs w:val="20"/>
-        </w:rPr>
-        <w:t xml:space="preserve">Analysis of major hazard risks and provision of “redundant safety”</w:t>
-      </w:r>
-    </w:p>
-    <w:p>
-      <w:pPr>
-        <w:keepNext/>
-        <w:spacing w:after="80" w:before="160"/>
-      </w:pPr>
-      <w:r>
-        <w:rPr>
-          <w:rFonts w:ascii="Tahoma" w:cs="Tahoma" w:eastAsia="Tahoma" w:hAnsi="Tahoma"/>
-          <w:b/>
-          <w:bCs/>
-          <w:color w:val="B5692B"/>
-          <w:sz w:val="20"/>
-          <w:szCs w:val="20"/>
-        </w:rPr>
-        <w:t xml:space="preserve">Maintaining first-aid preparedness and participation in emergency preparedness</w:t>
-      </w:r>
-    </w:p>
-    <w:p>
-      <w:pPr>
-        <w:pStyle w:val="ListParagraph"/>
-        <w:numPr>
-          <w:ilvl w:val="0"/>
-          <w:numId w:val="2"/>
-        </w:numPr>
-        <w:spacing w:after="60" w:line="268"/>
-        <w:jc w:val="both"/>
-      </w:pPr>
-      <w:r>
-        <w:rPr>
-          <w:rFonts w:ascii="Tahoma" w:cs="Tahoma" w:eastAsia="Tahoma" w:hAnsi="Tahoma"/>
-          <w:sz w:val="20"/>
-          <w:szCs w:val="20"/>
-        </w:rPr>
-        <w:t xml:space="preserve">Provision of first-aid services at the workplace when appropriate</w:t>
-      </w:r>
-    </w:p>
-    <w:p>
-      <w:pPr>
-        <w:pStyle w:val="ListParagraph"/>
-        <w:numPr>
-          <w:ilvl w:val="0"/>
-          <w:numId w:val="2"/>
-        </w:numPr>
-        <w:spacing w:after="60" w:line="268"/>
-        <w:jc w:val="both"/>
-      </w:pPr>
-      <w:r>
-        <w:rPr>
-          <w:rFonts w:ascii="Tahoma" w:cs="Tahoma" w:eastAsia="Tahoma" w:hAnsi="Tahoma"/>
-          <w:sz w:val="20"/>
-          <w:szCs w:val="20"/>
-        </w:rPr>
-        <w:t xml:space="preserve">Introduction to and training in first-aid practices for workers and supervisors</w:t>
-      </w:r>
-    </w:p>
-    <w:p>
-      <w:pPr>
-        <w:pStyle w:val="ListParagraph"/>
-        <w:numPr>
-          <w:ilvl w:val="0"/>
-          <w:numId w:val="2"/>
-        </w:numPr>
-        <w:spacing w:after="60" w:line="268"/>
-        <w:jc w:val="both"/>
-      </w:pPr>
-      <w:r>
-        <w:rPr>
-          <w:rFonts w:ascii="Tahoma" w:cs="Tahoma" w:eastAsia="Tahoma" w:hAnsi="Tahoma"/>
-          <w:sz w:val="20"/>
-          <w:szCs w:val="20"/>
-        </w:rPr>
-        <w:t xml:space="preserve">Maintenance and periodic inspection of first-aid readiness and facilities</w:t>
-      </w:r>
-    </w:p>
-    <w:p>
-      <w:pPr>
-        <w:pStyle w:val="ListParagraph"/>
-        <w:numPr>
-          <w:ilvl w:val="0"/>
-          <w:numId w:val="2"/>
-        </w:numPr>
-        <w:spacing w:after="60" w:line="268"/>
-        <w:jc w:val="both"/>
-      </w:pPr>
-      <w:r>
-        <w:rPr>
-          <w:rFonts w:ascii="Tahoma" w:cs="Tahoma" w:eastAsia="Tahoma" w:hAnsi="Tahoma"/>
-          <w:sz w:val="20"/>
-          <w:szCs w:val="20"/>
-        </w:rPr>
-        <w:t xml:space="preserve">Participation from the health point of view in emergency planning and in organizing the health elements of emergency response</w:t>
-      </w:r>
-    </w:p>
-    <w:p>
-      <w:pPr>
-        <w:keepNext/>
-        <w:spacing w:after="80" w:before="160"/>
-      </w:pPr>
-      <w:r>
-        <w:rPr>
-          <w:rFonts w:ascii="Tahoma" w:cs="Tahoma" w:eastAsia="Tahoma" w:hAnsi="Tahoma"/>
-          <w:b/>
-          <w:bCs/>
-          <w:color w:val="B5692B"/>
-          <w:sz w:val="20"/>
-          <w:szCs w:val="20"/>
-        </w:rPr>
-        <w:t xml:space="preserve">Diagnosis of occupational and work-related diseases</w:t>
-      </w:r>
-    </w:p>
-    <w:p>
-      <w:pPr>
-        <w:pStyle w:val="ListParagraph"/>
-        <w:numPr>
-          <w:ilvl w:val="0"/>
-          <w:numId w:val="2"/>
-        </w:numPr>
-        <w:spacing w:after="60" w:line="268"/>
-        <w:jc w:val="both"/>
-      </w:pPr>
-      <w:r>
-        <w:rPr>
-          <w:rFonts w:ascii="Tahoma" w:cs="Tahoma" w:eastAsia="Tahoma" w:hAnsi="Tahoma"/>
-          <w:sz w:val="20"/>
-          <w:szCs w:val="20"/>
-        </w:rPr>
-        <w:t xml:space="preserve">Identification of exposure that may cause the disease.</w:t>
-      </w:r>
-    </w:p>
-    <w:p>
-      <w:pPr>
-        <w:pStyle w:val="ListParagraph"/>
-        <w:numPr>
-          <w:ilvl w:val="0"/>
-          <w:numId w:val="2"/>
-        </w:numPr>
-        <w:spacing w:after="60" w:line="268"/>
-        <w:jc w:val="both"/>
-      </w:pPr>
-      <w:r>
-        <w:rPr>
-          <w:rFonts w:ascii="Tahoma" w:cs="Tahoma" w:eastAsia="Tahoma" w:hAnsi="Tahoma"/>
-          <w:sz w:val="20"/>
-          <w:szCs w:val="20"/>
-        </w:rPr>
-        <w:t xml:space="preserve">Examination of clinical findings known to be associated with the specific exposure.</w:t>
-      </w:r>
-    </w:p>
-    <w:p>
-      <w:pPr>
-        <w:pStyle w:val="ListParagraph"/>
-        <w:numPr>
-          <w:ilvl w:val="0"/>
-          <w:numId w:val="2"/>
-        </w:numPr>
-        <w:spacing w:after="60" w:line="268"/>
-        <w:jc w:val="both"/>
-      </w:pPr>
-      <w:r>
-        <w:rPr>
-          <w:rFonts w:ascii="Tahoma" w:cs="Tahoma" w:eastAsia="Tahoma" w:hAnsi="Tahoma"/>
-          <w:sz w:val="20"/>
-          <w:szCs w:val="20"/>
-        </w:rPr>
-        <w:t xml:space="preserve">Exclusion of nonoccupational factors as a possible cause of disease</w:t>
-      </w:r>
-    </w:p>
-    <w:p>
-      <w:pPr>
-        <w:pStyle w:val="ListParagraph"/>
-        <w:numPr>
-          <w:ilvl w:val="0"/>
-          <w:numId w:val="2"/>
-        </w:numPr>
-        <w:spacing w:after="60" w:line="268"/>
-        <w:jc w:val="both"/>
-      </w:pPr>
-      <w:r>
-        <w:rPr>
-          <w:rFonts w:ascii="Tahoma" w:cs="Tahoma" w:eastAsia="Tahoma" w:hAnsi="Tahoma"/>
-          <w:sz w:val="20"/>
-          <w:szCs w:val="20"/>
-        </w:rPr>
-        <w:t xml:space="preserve">Conclusion on existence or nonexistence of occupational disease (diagnosis) Statement on occupational disease for workmen's compensation</w:t>
-      </w:r>
-    </w:p>
-    <w:p>
-      <w:pPr>
-        <w:pStyle w:val="ListParagraph"/>
-        <w:numPr>
-          <w:ilvl w:val="0"/>
-          <w:numId w:val="2"/>
-        </w:numPr>
-        <w:spacing w:after="60" w:line="268"/>
-        <w:jc w:val="both"/>
-      </w:pPr>
-      <w:r>
-        <w:rPr>
-          <w:rFonts w:ascii="Tahoma" w:cs="Tahoma" w:eastAsia="Tahoma" w:hAnsi="Tahoma"/>
-          <w:sz w:val="20"/>
-          <w:szCs w:val="20"/>
-        </w:rPr>
-        <w:t xml:space="preserve">Proposals for preventive actions to the workplace of the worker in question Notification of occupational diseases to authorities</w:t>
-      </w:r>
-    </w:p>
-    <w:p>
-      <w:pPr>
-        <w:keepNext/>
-        <w:spacing w:after="80" w:before="160"/>
-      </w:pPr>
-      <w:r>
-        <w:rPr>
-          <w:rFonts w:ascii="Tahoma" w:cs="Tahoma" w:eastAsia="Tahoma" w:hAnsi="Tahoma"/>
-          <w:b/>
-          <w:bCs/>
-          <w:color w:val="B5692B"/>
-          <w:sz w:val="20"/>
-          <w:szCs w:val="20"/>
-        </w:rPr>
-        <w:t xml:space="preserve">General health care, curative and rehabilitation services</w:t>
-      </w:r>
-    </w:p>
-    <w:p>
-      <w:pPr>
-        <w:pStyle w:val="ListParagraph"/>
-        <w:numPr>
-          <w:ilvl w:val="0"/>
-          <w:numId w:val="2"/>
-        </w:numPr>
-        <w:spacing w:after="60" w:line="268"/>
-        <w:jc w:val="both"/>
-      </w:pPr>
-      <w:r>
-        <w:rPr>
-          <w:rFonts w:ascii="Tahoma" w:cs="Tahoma" w:eastAsia="Tahoma" w:hAnsi="Tahoma"/>
-          <w:sz w:val="20"/>
-          <w:szCs w:val="20"/>
-        </w:rPr>
-        <w:t xml:space="preserve">Immunizations and other preventive measures</w:t>
-      </w:r>
-    </w:p>
-    <w:p>
-      <w:pPr>
-        <w:pStyle w:val="ListParagraph"/>
-        <w:numPr>
-          <w:ilvl w:val="0"/>
-          <w:numId w:val="2"/>
-        </w:numPr>
-        <w:spacing w:after="60" w:line="268"/>
-        <w:jc w:val="both"/>
-      </w:pPr>
-      <w:r>
-        <w:rPr>
-          <w:rFonts w:ascii="Tahoma" w:cs="Tahoma" w:eastAsia="Tahoma" w:hAnsi="Tahoma"/>
-          <w:sz w:val="20"/>
-          <w:szCs w:val="20"/>
-        </w:rPr>
-        <w:t xml:space="preserve">Participation in public health actions and programs</w:t>
-      </w:r>
-    </w:p>
-    <w:p>
-      <w:pPr>
-        <w:pStyle w:val="ListParagraph"/>
-        <w:numPr>
-          <w:ilvl w:val="0"/>
-          <w:numId w:val="2"/>
-        </w:numPr>
-        <w:spacing w:after="60" w:line="268"/>
-        <w:jc w:val="both"/>
-      </w:pPr>
-      <w:r>
-        <w:rPr>
-          <w:rFonts w:ascii="Tahoma" w:cs="Tahoma" w:eastAsia="Tahoma" w:hAnsi="Tahoma"/>
-          <w:sz w:val="20"/>
-          <w:szCs w:val="20"/>
-        </w:rPr>
-        <w:t xml:space="preserve">General-practitioner level of general health services</w:t>
-      </w:r>
-    </w:p>
-    <w:p>
-      <w:pPr>
-        <w:pStyle w:val="ListParagraph"/>
-        <w:numPr>
-          <w:ilvl w:val="0"/>
-          <w:numId w:val="2"/>
-        </w:numPr>
-        <w:spacing w:after="60" w:line="268"/>
-        <w:jc w:val="both"/>
-      </w:pPr>
-      <w:r>
-        <w:rPr>
-          <w:rFonts w:ascii="Tahoma" w:cs="Tahoma" w:eastAsia="Tahoma" w:hAnsi="Tahoma"/>
-          <w:sz w:val="20"/>
-          <w:szCs w:val="20"/>
-        </w:rPr>
-        <w:t xml:space="preserve">Inspection and advice on canteens and sanitary facilities</w:t>
-      </w:r>
-    </w:p>
-    <w:p>
-      <w:pPr>
-        <w:pStyle w:val="ListParagraph"/>
-        <w:numPr>
-          <w:ilvl w:val="0"/>
-          <w:numId w:val="2"/>
-        </w:numPr>
-        <w:spacing w:after="60" w:line="268"/>
-        <w:jc w:val="both"/>
-      </w:pPr>
-      <w:r>
-        <w:rPr>
-          <w:rFonts w:ascii="Tahoma" w:cs="Tahoma" w:eastAsia="Tahoma" w:hAnsi="Tahoma"/>
-          <w:sz w:val="20"/>
-          <w:szCs w:val="20"/>
-        </w:rPr>
-        <w:t xml:space="preserve">Advice and education in general hygiene for personnel and the work community General health promotion and introduction of a healthy lifestyle</w:t>
-      </w:r>
-    </w:p>
-    <w:p>
-      <w:pPr>
-        <w:pStyle w:val="ListParagraph"/>
-        <w:numPr>
-          <w:ilvl w:val="0"/>
-          <w:numId w:val="2"/>
-        </w:numPr>
-        <w:spacing w:after="60" w:line="268"/>
-        <w:jc w:val="both"/>
-      </w:pPr>
-      <w:r>
-        <w:rPr>
-          <w:rFonts w:ascii="Tahoma" w:cs="Tahoma" w:eastAsia="Tahoma" w:hAnsi="Tahoma"/>
-          <w:sz w:val="20"/>
-          <w:szCs w:val="20"/>
-        </w:rPr>
-        <w:t xml:space="preserve">Rehabilitation and advice on return to work</w:t>
-      </w:r>
-    </w:p>
-    <w:p>
-      <w:pPr>
-        <w:keepNext/>
-        <w:spacing w:after="80" w:before="160"/>
-      </w:pPr>
-      <w:r>
-        <w:rPr>
-          <w:rFonts w:ascii="Tahoma" w:cs="Tahoma" w:eastAsia="Tahoma" w:hAnsi="Tahoma"/>
-          <w:b/>
-          <w:bCs/>
-          <w:color w:val="B5692B"/>
-          <w:sz w:val="20"/>
-          <w:szCs w:val="20"/>
-        </w:rPr>
-        <w:t xml:space="preserve">Record keeping</w:t>
-      </w:r>
-    </w:p>
-    <w:p>
-      <w:pPr>
-        <w:pStyle w:val="ListParagraph"/>
-        <w:numPr>
-          <w:ilvl w:val="0"/>
-          <w:numId w:val="2"/>
-        </w:numPr>
-        <w:spacing w:after="60" w:line="268"/>
-        <w:jc w:val="both"/>
-      </w:pPr>
-      <w:r>
-        <w:rPr>
-          <w:rFonts w:ascii="Tahoma" w:cs="Tahoma" w:eastAsia="Tahoma" w:hAnsi="Tahoma"/>
-          <w:sz w:val="20"/>
-          <w:szCs w:val="20"/>
-        </w:rPr>
-        <w:t xml:space="preserve">Maintenance of general health records if workers are treated as patients or health service clients.</w:t>
-      </w:r>
-    </w:p>
-    <w:p>
-      <w:pPr>
-        <w:pStyle w:val="ListParagraph"/>
-        <w:numPr>
-          <w:ilvl w:val="0"/>
-          <w:numId w:val="2"/>
-        </w:numPr>
-        <w:spacing w:after="60" w:line="268"/>
-        <w:jc w:val="both"/>
-      </w:pPr>
-      <w:r>
-        <w:rPr>
-          <w:rFonts w:ascii="Tahoma" w:cs="Tahoma" w:eastAsia="Tahoma" w:hAnsi="Tahoma"/>
-          <w:sz w:val="20"/>
-          <w:szCs w:val="20"/>
-        </w:rPr>
-        <w:t xml:space="preserve">Collection of data on surveyed, detected, and measured occupational exposures and risk assessments.</w:t>
-      </w:r>
-    </w:p>
-    <w:p>
-      <w:pPr>
-        <w:pStyle w:val="ListParagraph"/>
-        <w:numPr>
-          <w:ilvl w:val="0"/>
-          <w:numId w:val="2"/>
-        </w:numPr>
-        <w:spacing w:after="60" w:line="268"/>
-        <w:jc w:val="both"/>
-      </w:pPr>
-      <w:r>
-        <w:rPr>
-          <w:rFonts w:ascii="Tahoma" w:cs="Tahoma" w:eastAsia="Tahoma" w:hAnsi="Tahoma"/>
-          <w:sz w:val="20"/>
-          <w:szCs w:val="20"/>
-        </w:rPr>
-        <w:t xml:space="preserve">Collection of statistics on occupational diseases and injuries</w:t>
-      </w:r>
-    </w:p>
-    <w:p>
-      <w:pPr>
-        <w:pStyle w:val="ListParagraph"/>
-        <w:numPr>
-          <w:ilvl w:val="0"/>
-          <w:numId w:val="2"/>
-        </w:numPr>
-        <w:spacing w:after="60" w:line="268"/>
-        <w:jc w:val="both"/>
-      </w:pPr>
-      <w:r>
-        <w:rPr>
-          <w:rFonts w:ascii="Tahoma" w:cs="Tahoma" w:eastAsia="Tahoma" w:hAnsi="Tahoma"/>
-          <w:sz w:val="20"/>
-          <w:szCs w:val="20"/>
-        </w:rPr>
-        <w:t xml:space="preserve">Collection of data on health examinations</w:t>
-      </w:r>
-    </w:p>
-    <w:p>
-      <w:pPr>
-        <w:pStyle w:val="ListParagraph"/>
-        <w:numPr>
-          <w:ilvl w:val="0"/>
-          <w:numId w:val="2"/>
-        </w:numPr>
-        <w:spacing w:after="60" w:line="268"/>
-        <w:jc w:val="both"/>
-      </w:pPr>
-      <w:r>
-        <w:rPr>
-          <w:rFonts w:ascii="Tahoma" w:cs="Tahoma" w:eastAsia="Tahoma" w:hAnsi="Tahoma"/>
-          <w:sz w:val="20"/>
-          <w:szCs w:val="20"/>
-        </w:rPr>
-        <w:t xml:space="preserve">Preparation of documents on proposals for preventive and control measures</w:t>
-      </w:r>
-    </w:p>
-    <w:p>
-      <w:pPr>
-        <w:keepNext/>
-        <w:spacing w:after="80" w:before="160"/>
-      </w:pPr>
-      <w:r>
-        <w:rPr>
-          <w:rFonts w:ascii="Tahoma" w:cs="Tahoma" w:eastAsia="Tahoma" w:hAnsi="Tahoma"/>
-          <w:b/>
-          <w:bCs/>
-          <w:color w:val="B5692B"/>
-          <w:sz w:val="20"/>
-          <w:szCs w:val="20"/>
-        </w:rPr>
-        <w:t xml:space="preserve">Evaluation</w:t>
-      </w:r>
-    </w:p>
-    <w:p>
-      <w:pPr>
-        <w:pStyle w:val="ListParagraph"/>
-        <w:numPr>
-          <w:ilvl w:val="0"/>
-          <w:numId w:val="2"/>
-        </w:numPr>
-        <w:spacing w:after="60" w:line="268"/>
-        <w:jc w:val="both"/>
-      </w:pPr>
-      <w:r>
-        <w:rPr>
-          <w:rFonts w:ascii="Tahoma" w:cs="Tahoma" w:eastAsia="Tahoma" w:hAnsi="Tahoma"/>
-          <w:sz w:val="20"/>
-          <w:szCs w:val="20"/>
-        </w:rPr>
-        <w:t xml:space="preserve">Self-auditing of content of the services</w:t>
-      </w:r>
-    </w:p>
-    <w:p>
-      <w:pPr>
-        <w:pStyle w:val="ListParagraph"/>
-        <w:numPr>
-          <w:ilvl w:val="0"/>
-          <w:numId w:val="2"/>
-        </w:numPr>
-        <w:spacing w:after="60" w:line="268"/>
-        <w:jc w:val="both"/>
-      </w:pPr>
-      <w:r>
-        <w:rPr>
-          <w:rFonts w:ascii="Tahoma" w:cs="Tahoma" w:eastAsia="Tahoma" w:hAnsi="Tahoma"/>
-          <w:sz w:val="20"/>
-          <w:szCs w:val="20"/>
-        </w:rPr>
-        <w:t xml:space="preserve">Analysis of data on work environment surveillance, exposures, results of health examinations, statistics on occupational diseases and accidents</w:t>
-      </w:r>
-    </w:p>
-    <w:p>
-      <w:pPr>
-        <w:pStyle w:val="ListParagraph"/>
-        <w:numPr>
-          <w:ilvl w:val="0"/>
-          <w:numId w:val="2"/>
-        </w:numPr>
-        <w:spacing w:after="60" w:line="268"/>
-        <w:jc w:val="both"/>
-      </w:pPr>
-      <w:r>
-        <w:rPr>
-          <w:rFonts w:ascii="Tahoma" w:cs="Tahoma" w:eastAsia="Tahoma" w:hAnsi="Tahoma"/>
-          <w:sz w:val="20"/>
-          <w:szCs w:val="20"/>
-        </w:rPr>
-        <w:t xml:space="preserve">Analysis of trends of key indicators (exposures, accidents, diseases, sickness absenteeism)</w:t>
-      </w:r>
-    </w:p>
-    <w:p>
-      <w:pPr>
-        <w:pStyle w:val="ListParagraph"/>
-        <w:numPr>
-          <w:ilvl w:val="0"/>
-          <w:numId w:val="2"/>
-        </w:numPr>
-        <w:spacing w:after="60" w:line="268"/>
-        <w:jc w:val="both"/>
-      </w:pPr>
-      <w:r>
-        <w:rPr>
-          <w:rFonts w:ascii="Tahoma" w:cs="Tahoma" w:eastAsia="Tahoma" w:hAnsi="Tahoma"/>
-          <w:sz w:val="20"/>
-          <w:szCs w:val="20"/>
-        </w:rPr>
-        <w:t xml:space="preserve">Analysis of performance of services (in view of preset objectives)</w:t>
-      </w:r>
-    </w:p>
-    <w:p>
-      <w:pPr>
-        <w:pStyle w:val="ListParagraph"/>
-        <w:numPr>
-          <w:ilvl w:val="0"/>
-          <w:numId w:val="2"/>
-        </w:numPr>
-        <w:spacing w:after="60" w:line="268"/>
-        <w:jc w:val="both"/>
-      </w:pPr>
-      <w:r>
-        <w:rPr>
-          <w:rFonts w:ascii="Tahoma" w:cs="Tahoma" w:eastAsia="Tahoma" w:hAnsi="Tahoma"/>
-          <w:sz w:val="20"/>
-          <w:szCs w:val="20"/>
-        </w:rPr>
-        <w:t xml:space="preserve">Identification of needs to modify and develop services</w:t>
-      </w:r>
-    </w:p>
+    <w:tbl>
+      <w:tblPr>
+        <w:tblW w:type="dxa" w:w="9360"/>
+        <w:tblBorders>
+          <w:top w:val="single" w:color="auto" w:sz="4"/>
+          <w:left w:val="single" w:color="auto" w:sz="4"/>
+          <w:bottom w:val="single" w:color="auto" w:sz="4"/>
+          <w:right w:val="single" w:color="auto" w:sz="4"/>
+          <w:insideH w:val="single" w:color="auto" w:sz="4"/>
+          <w:insideV w:val="single" w:color="auto" w:sz="4"/>
+        </w:tblBorders>
+      </w:tblPr>
+      <w:tblGrid>
+        <w:gridCol w:w="2600"/>
+        <w:gridCol w:w="6760"/>
+      </w:tblGrid>
+      <w:tr>
+        <w:trPr>
+          <w:tblHeader/>
+        </w:trPr>
+        <w:tc>
+          <w:tcPr>
+            <w:tcW w:type="dxa" w:w="2600"/>
+            <w:tcBorders>
+              <w:top w:val="single" w:color="BFB3AA" w:sz="4"/>
+              <w:left w:val="single" w:color="BFB3AA" w:sz="4"/>
+              <w:bottom w:val="single" w:color="BFB3AA" w:sz="4"/>
+              <w:right w:val="single" w:color="BFB3AA" w:sz="4"/>
+            </w:tcBorders>
+            <w:shd w:fill="542A12" w:color="auto" w:val="clear"/>
+            <w:tcMar>
+              <w:top w:type="dxa" w:w="60"/>
+              <w:left w:type="dxa" w:w="120"/>
+              <w:bottom w:type="dxa" w:w="60"/>
+              <w:right w:type="dxa" w:w="120"/>
+            </w:tcMar>
+          </w:tcPr>
+          <w:p>
+            <w:r>
+              <w:rPr>
+                <w:rFonts w:ascii="Tahoma" w:cs="Tahoma" w:eastAsia="Tahoma" w:hAnsi="Tahoma"/>
+                <w:b/>
+                <w:bCs/>
+                <w:color w:val="FFFFFF"/>
+                <w:sz w:val="18"/>
+                <w:szCs w:val="18"/>
+              </w:rPr>
+              <w:t xml:space="preserve">Type of activity</w:t>
+            </w:r>
+          </w:p>
+        </w:tc>
+        <w:tc>
+          <w:tcPr>
+            <w:tcW w:type="dxa" w:w="6760"/>
+            <w:tcBorders>
+              <w:top w:val="single" w:color="BFB3AA" w:sz="4"/>
+              <w:left w:val="single" w:color="BFB3AA" w:sz="4"/>
+              <w:bottom w:val="single" w:color="BFB3AA" w:sz="4"/>
+              <w:right w:val="single" w:color="BFB3AA" w:sz="4"/>
+            </w:tcBorders>
+            <w:shd w:fill="542A12" w:color="auto" w:val="clear"/>
+            <w:tcMar>
+              <w:top w:type="dxa" w:w="60"/>
+              <w:left w:type="dxa" w:w="120"/>
+              <w:bottom w:type="dxa" w:w="60"/>
+              <w:right w:type="dxa" w:w="120"/>
+            </w:tcMar>
+          </w:tcPr>
+          <w:p>
+            <w:r>
+              <w:rPr>
+                <w:rFonts w:ascii="Tahoma" w:cs="Tahoma" w:eastAsia="Tahoma" w:hAnsi="Tahoma"/>
+                <w:b/>
+                <w:bCs/>
+                <w:color w:val="FFFFFF"/>
+                <w:sz w:val="18"/>
+                <w:szCs w:val="18"/>
+              </w:rPr>
+              <w:t xml:space="preserve">Measures applied and goals</w:t>
+            </w:r>
+          </w:p>
+        </w:tc>
+      </w:tr>
+      <w:tr>
+        <w:tc>
+          <w:tcPr>
+            <w:tcW w:type="dxa" w:w="2600"/>
+            <w:tcBorders>
+              <w:top w:val="single" w:color="BFB3AA" w:sz="4"/>
+              <w:left w:val="single" w:color="BFB3AA" w:sz="4"/>
+              <w:bottom w:val="single" w:color="BFB3AA" w:sz="4"/>
+              <w:right w:val="single" w:color="BFB3AA" w:sz="4"/>
+            </w:tcBorders>
+            <w:tcMar>
+              <w:top w:type="dxa" w:w="60"/>
+              <w:left w:type="dxa" w:w="120"/>
+              <w:bottom w:type="dxa" w:w="60"/>
+              <w:right w:type="dxa" w:w="120"/>
+            </w:tcMar>
+            <w:vAlign w:val="top"/>
+          </w:tcPr>
+          <w:p>
+            <w:r>
+              <w:rPr>
+                <w:rFonts w:ascii="Tahoma" w:cs="Tahoma" w:eastAsia="Tahoma" w:hAnsi="Tahoma"/>
+                <w:b/>
+                <w:bCs/>
+                <w:color w:val="542A12"/>
+                <w:sz w:val="18"/>
+                <w:szCs w:val="18"/>
+              </w:rPr>
+              <w:t xml:space="preserve">Orientation and planning</w:t>
+            </w:r>
+          </w:p>
+        </w:tc>
+        <w:tc>
+          <w:tcPr>
+            <w:tcW w:type="dxa" w:w="6760"/>
+            <w:tcBorders>
+              <w:top w:val="single" w:color="BFB3AA" w:sz="4"/>
+              <w:left w:val="single" w:color="BFB3AA" w:sz="4"/>
+              <w:bottom w:val="single" w:color="BFB3AA" w:sz="4"/>
+              <w:right w:val="single" w:color="BFB3AA" w:sz="4"/>
+            </w:tcBorders>
+            <w:tcMar>
+              <w:top w:type="dxa" w:w="60"/>
+              <w:left w:type="dxa" w:w="120"/>
+              <w:bottom w:type="dxa" w:w="60"/>
+              <w:right w:type="dxa" w:w="120"/>
+            </w:tcMar>
+          </w:tcPr>
+          <w:p>
+            <w:pPr>
+              <w:spacing w:after="40" w:line="252"/>
+              <w:ind w:left="220" w:hanging="150"/>
+            </w:pPr>
+            <w:r>
+              <w:rPr>
+                <w:rFonts w:ascii="Tahoma" w:cs="Tahoma" w:eastAsia="Tahoma" w:hAnsi="Tahoma"/>
+                <w:color w:val="B5692B"/>
+                <w:sz w:val="16"/>
+                <w:szCs w:val="16"/>
+              </w:rPr>
+              <w:t xml:space="preserve">•  </w:t>
+            </w:r>
+            <w:r>
+              <w:rPr>
+                <w:rFonts w:ascii="Tahoma" w:cs="Tahoma" w:eastAsia="Tahoma" w:hAnsi="Tahoma"/>
+                <w:sz w:val="16"/>
+                <w:szCs w:val="16"/>
+              </w:rPr>
+              <w:t xml:space="preserve">Analysis of the type of production to indicate the risks and problems typical of the branch or occupation in question.</w:t>
+            </w:r>
+          </w:p>
+          <w:p>
+            <w:pPr>
+              <w:spacing w:after="40" w:line="252"/>
+              <w:ind w:left="220" w:hanging="150"/>
+            </w:pPr>
+            <w:r>
+              <w:rPr>
+                <w:rFonts w:ascii="Tahoma" w:cs="Tahoma" w:eastAsia="Tahoma" w:hAnsi="Tahoma"/>
+                <w:color w:val="B5692B"/>
+                <w:sz w:val="16"/>
+                <w:szCs w:val="16"/>
+              </w:rPr>
+              <w:t xml:space="preserve">•  </w:t>
+            </w:r>
+            <w:r>
+              <w:rPr>
+                <w:rFonts w:ascii="Tahoma" w:cs="Tahoma" w:eastAsia="Tahoma" w:hAnsi="Tahoma"/>
+                <w:sz w:val="16"/>
+                <w:szCs w:val="16"/>
+              </w:rPr>
+              <w:t xml:space="preserve">Review of problems identified previously in the company.</w:t>
+            </w:r>
+          </w:p>
+          <w:p>
+            <w:pPr>
+              <w:spacing w:after="40" w:line="252"/>
+              <w:ind w:left="220" w:hanging="150"/>
+            </w:pPr>
+            <w:r>
+              <w:rPr>
+                <w:rFonts w:ascii="Tahoma" w:cs="Tahoma" w:eastAsia="Tahoma" w:hAnsi="Tahoma"/>
+                <w:color w:val="B5692B"/>
+                <w:sz w:val="16"/>
+                <w:szCs w:val="16"/>
+              </w:rPr>
+              <w:t xml:space="preserve">•  </w:t>
+            </w:r>
+            <w:r>
+              <w:rPr>
+                <w:rFonts w:ascii="Tahoma" w:cs="Tahoma" w:eastAsia="Tahoma" w:hAnsi="Tahoma"/>
+                <w:sz w:val="16"/>
+                <w:szCs w:val="16"/>
+              </w:rPr>
+              <w:t xml:space="preserve">Review of the characteristics of the workforce of the company</w:t>
+            </w:r>
+          </w:p>
+          <w:p>
+            <w:pPr>
+              <w:spacing w:after="40" w:line="252"/>
+              <w:ind w:left="220" w:hanging="150"/>
+            </w:pPr>
+            <w:r>
+              <w:rPr>
+                <w:rFonts w:ascii="Tahoma" w:cs="Tahoma" w:eastAsia="Tahoma" w:hAnsi="Tahoma"/>
+                <w:color w:val="B5692B"/>
+                <w:sz w:val="16"/>
+                <w:szCs w:val="16"/>
+              </w:rPr>
+              <w:t xml:space="preserve">•  </w:t>
+            </w:r>
+            <w:r>
+              <w:rPr>
+                <w:rFonts w:ascii="Tahoma" w:cs="Tahoma" w:eastAsia="Tahoma" w:hAnsi="Tahoma"/>
+                <w:sz w:val="16"/>
+                <w:szCs w:val="16"/>
+              </w:rPr>
+              <w:t xml:space="preserve">Review of available data on occupational diseases and accidents</w:t>
+            </w:r>
+          </w:p>
+          <w:p>
+            <w:pPr>
+              <w:spacing w:after="40" w:line="252"/>
+              <w:ind w:left="220" w:hanging="150"/>
+            </w:pPr>
+            <w:r>
+              <w:rPr>
+                <w:rFonts w:ascii="Tahoma" w:cs="Tahoma" w:eastAsia="Tahoma" w:hAnsi="Tahoma"/>
+                <w:color w:val="B5692B"/>
+                <w:sz w:val="16"/>
+                <w:szCs w:val="16"/>
+              </w:rPr>
+              <w:t xml:space="preserve">•  </w:t>
+            </w:r>
+            <w:r>
+              <w:rPr>
+                <w:rFonts w:ascii="Tahoma" w:cs="Tahoma" w:eastAsia="Tahoma" w:hAnsi="Tahoma"/>
+                <w:sz w:val="16"/>
+                <w:szCs w:val="16"/>
+              </w:rPr>
+              <w:t xml:space="preserve">Collection of data on work methods, chemical substances, and the like</w:t>
+            </w:r>
+          </w:p>
+          <w:p>
+            <w:pPr>
+              <w:spacing w:after="40" w:line="252"/>
+              <w:ind w:left="220" w:hanging="150"/>
+            </w:pPr>
+            <w:r>
+              <w:rPr>
+                <w:rFonts w:ascii="Tahoma" w:cs="Tahoma" w:eastAsia="Tahoma" w:hAnsi="Tahoma"/>
+                <w:color w:val="B5692B"/>
+                <w:sz w:val="16"/>
+                <w:szCs w:val="16"/>
+              </w:rPr>
+              <w:t xml:space="preserve">•  </w:t>
+            </w:r>
+            <w:r>
+              <w:rPr>
+                <w:rFonts w:ascii="Tahoma" w:cs="Tahoma" w:eastAsia="Tahoma" w:hAnsi="Tahoma"/>
+                <w:sz w:val="16"/>
+                <w:szCs w:val="16"/>
+              </w:rPr>
+              <w:t xml:space="preserve">Assessment of the knowledge of employers and employees about occupational health problems</w:t>
+            </w:r>
+          </w:p>
+          <w:p>
+            <w:pPr>
+              <w:spacing w:after="40" w:line="252"/>
+              <w:ind w:left="220" w:hanging="150"/>
+            </w:pPr>
+            <w:r>
+              <w:rPr>
+                <w:rFonts w:ascii="Tahoma" w:cs="Tahoma" w:eastAsia="Tahoma" w:hAnsi="Tahoma"/>
+                <w:color w:val="B5692B"/>
+                <w:sz w:val="16"/>
+                <w:szCs w:val="16"/>
+              </w:rPr>
+              <w:t xml:space="preserve">•  </w:t>
+            </w:r>
+            <w:r>
+              <w:rPr>
+                <w:rFonts w:ascii="Tahoma" w:cs="Tahoma" w:eastAsia="Tahoma" w:hAnsi="Tahoma"/>
+                <w:sz w:val="16"/>
+                <w:szCs w:val="16"/>
+              </w:rPr>
+              <w:t xml:space="preserve">Planning for changes in production systems (e.g., installation of new facilities, machinery and equipment)</w:t>
+            </w:r>
+          </w:p>
+        </w:tc>
+      </w:tr>
+      <w:tr>
+        <w:tc>
+          <w:tcPr>
+            <w:tcW w:type="dxa" w:w="2600"/>
+            <w:tcBorders>
+              <w:top w:val="single" w:color="BFB3AA" w:sz="4"/>
+              <w:left w:val="single" w:color="BFB3AA" w:sz="4"/>
+              <w:bottom w:val="single" w:color="BFB3AA" w:sz="4"/>
+              <w:right w:val="single" w:color="BFB3AA" w:sz="4"/>
+            </w:tcBorders>
+            <w:tcMar>
+              <w:top w:type="dxa" w:w="60"/>
+              <w:left w:type="dxa" w:w="120"/>
+              <w:bottom w:type="dxa" w:w="60"/>
+              <w:right w:type="dxa" w:w="120"/>
+            </w:tcMar>
+            <w:vAlign w:val="top"/>
+          </w:tcPr>
+          <w:p>
+            <w:r>
+              <w:rPr>
+                <w:rFonts w:ascii="Tahoma" w:cs="Tahoma" w:eastAsia="Tahoma" w:hAnsi="Tahoma"/>
+                <w:b/>
+                <w:bCs/>
+                <w:color w:val="542A12"/>
+                <w:sz w:val="18"/>
+                <w:szCs w:val="18"/>
+              </w:rPr>
+              <w:t xml:space="preserve">Surveillance of the work environment</w:t>
+            </w:r>
+          </w:p>
+        </w:tc>
+        <w:tc>
+          <w:tcPr>
+            <w:tcW w:type="dxa" w:w="6760"/>
+            <w:tcBorders>
+              <w:top w:val="single" w:color="BFB3AA" w:sz="4"/>
+              <w:left w:val="single" w:color="BFB3AA" w:sz="4"/>
+              <w:bottom w:val="single" w:color="BFB3AA" w:sz="4"/>
+              <w:right w:val="single" w:color="BFB3AA" w:sz="4"/>
+            </w:tcBorders>
+            <w:tcMar>
+              <w:top w:type="dxa" w:w="60"/>
+              <w:left w:type="dxa" w:w="120"/>
+              <w:bottom w:type="dxa" w:w="60"/>
+              <w:right w:type="dxa" w:w="120"/>
+            </w:tcMar>
+          </w:tcPr>
+          <w:p>
+            <w:pPr>
+              <w:spacing w:after="40" w:line="252"/>
+              <w:ind w:left="220" w:hanging="150"/>
+            </w:pPr>
+            <w:r>
+              <w:rPr>
+                <w:rFonts w:ascii="Tahoma" w:cs="Tahoma" w:eastAsia="Tahoma" w:hAnsi="Tahoma"/>
+                <w:color w:val="B5692B"/>
+                <w:sz w:val="16"/>
+                <w:szCs w:val="16"/>
+              </w:rPr>
+              <w:t xml:space="preserve">•  </w:t>
+            </w:r>
+            <w:r>
+              <w:rPr>
+                <w:rFonts w:ascii="Tahoma" w:cs="Tahoma" w:eastAsia="Tahoma" w:hAnsi="Tahoma"/>
+                <w:sz w:val="16"/>
+                <w:szCs w:val="16"/>
+              </w:rPr>
+              <w:t xml:space="preserve">Identification and evaluation of ergonomic factors that may affect workers' health. Assessment of conditions of occupational hygiene and factors, such as physical, chemical, and biological exposures that may generate risks to the health of workers. Assessment, where appropriate, of workers' exposure to adverse psychological factors and aspects of work organization.</w:t>
+            </w:r>
+          </w:p>
+          <w:p>
+            <w:pPr>
+              <w:spacing w:after="40" w:line="252"/>
+              <w:ind w:left="220" w:hanging="150"/>
+            </w:pPr>
+            <w:r>
+              <w:rPr>
+                <w:rFonts w:ascii="Tahoma" w:cs="Tahoma" w:eastAsia="Tahoma" w:hAnsi="Tahoma"/>
+                <w:color w:val="B5692B"/>
+                <w:sz w:val="16"/>
+                <w:szCs w:val="16"/>
+              </w:rPr>
+              <w:t xml:space="preserve">•  </w:t>
+            </w:r>
+            <w:r>
+              <w:rPr>
+                <w:rFonts w:ascii="Tahoma" w:cs="Tahoma" w:eastAsia="Tahoma" w:hAnsi="Tahoma"/>
+                <w:sz w:val="16"/>
+                <w:szCs w:val="16"/>
+              </w:rPr>
+              <w:t xml:space="preserve">Risk assessment of occupational accidents and major hazards</w:t>
+            </w:r>
+          </w:p>
+          <w:p>
+            <w:pPr>
+              <w:spacing w:after="40" w:line="252"/>
+              <w:ind w:left="220" w:hanging="150"/>
+            </w:pPr>
+            <w:r>
+              <w:rPr>
+                <w:rFonts w:ascii="Tahoma" w:cs="Tahoma" w:eastAsia="Tahoma" w:hAnsi="Tahoma"/>
+                <w:color w:val="B5692B"/>
+                <w:sz w:val="16"/>
+                <w:szCs w:val="16"/>
+              </w:rPr>
+              <w:t xml:space="preserve">•  </w:t>
+            </w:r>
+            <w:r>
+              <w:rPr>
+                <w:rFonts w:ascii="Tahoma" w:cs="Tahoma" w:eastAsia="Tahoma" w:hAnsi="Tahoma"/>
+                <w:sz w:val="16"/>
+                <w:szCs w:val="16"/>
+              </w:rPr>
+              <w:t xml:space="preserve">Assessment of collective and personal protective equipment</w:t>
+            </w:r>
+          </w:p>
+          <w:p>
+            <w:pPr>
+              <w:spacing w:after="40" w:line="252"/>
+              <w:ind w:left="220" w:hanging="150"/>
+            </w:pPr>
+            <w:r>
+              <w:rPr>
+                <w:rFonts w:ascii="Tahoma" w:cs="Tahoma" w:eastAsia="Tahoma" w:hAnsi="Tahoma"/>
+                <w:color w:val="B5692B"/>
+                <w:sz w:val="16"/>
+                <w:szCs w:val="16"/>
+              </w:rPr>
+              <w:t xml:space="preserve">•  </w:t>
+            </w:r>
+            <w:r>
+              <w:rPr>
+                <w:rFonts w:ascii="Tahoma" w:cs="Tahoma" w:eastAsia="Tahoma" w:hAnsi="Tahoma"/>
+                <w:sz w:val="16"/>
+                <w:szCs w:val="16"/>
+              </w:rPr>
+              <w:t xml:space="preserve">Assessment of control systems designed to eliminate, prevent, or reduce exposure Assessment of general hygiene and sanitary facilities</w:t>
+            </w:r>
+          </w:p>
+        </w:tc>
+      </w:tr>
+      <w:tr>
+        <w:tc>
+          <w:tcPr>
+            <w:tcW w:type="dxa" w:w="2600"/>
+            <w:tcBorders>
+              <w:top w:val="single" w:color="BFB3AA" w:sz="4"/>
+              <w:left w:val="single" w:color="BFB3AA" w:sz="4"/>
+              <w:bottom w:val="single" w:color="BFB3AA" w:sz="4"/>
+              <w:right w:val="single" w:color="BFB3AA" w:sz="4"/>
+            </w:tcBorders>
+            <w:tcMar>
+              <w:top w:type="dxa" w:w="60"/>
+              <w:left w:type="dxa" w:w="120"/>
+              <w:bottom w:type="dxa" w:w="60"/>
+              <w:right w:type="dxa" w:w="120"/>
+            </w:tcMar>
+            <w:vAlign w:val="top"/>
+          </w:tcPr>
+          <w:p>
+            <w:r>
+              <w:rPr>
+                <w:rFonts w:ascii="Tahoma" w:cs="Tahoma" w:eastAsia="Tahoma" w:hAnsi="Tahoma"/>
+                <w:b/>
+                <w:bCs/>
+                <w:color w:val="542A12"/>
+                <w:sz w:val="18"/>
+                <w:szCs w:val="18"/>
+              </w:rPr>
+              <w:t xml:space="preserve">Surveillance of worker's health</w:t>
+            </w:r>
+          </w:p>
+        </w:tc>
+        <w:tc>
+          <w:tcPr>
+            <w:tcW w:type="dxa" w:w="6760"/>
+            <w:tcBorders>
+              <w:top w:val="single" w:color="BFB3AA" w:sz="4"/>
+              <w:left w:val="single" w:color="BFB3AA" w:sz="4"/>
+              <w:bottom w:val="single" w:color="BFB3AA" w:sz="4"/>
+              <w:right w:val="single" w:color="BFB3AA" w:sz="4"/>
+            </w:tcBorders>
+            <w:tcMar>
+              <w:top w:type="dxa" w:w="60"/>
+              <w:left w:type="dxa" w:w="120"/>
+              <w:bottom w:type="dxa" w:w="60"/>
+              <w:right w:type="dxa" w:w="120"/>
+            </w:tcMar>
+          </w:tcPr>
+          <w:p>
+            <w:pPr>
+              <w:spacing w:after="40" w:line="252"/>
+              <w:ind w:left="220" w:hanging="150"/>
+            </w:pPr>
+            <w:r>
+              <w:rPr>
+                <w:rFonts w:ascii="Tahoma" w:cs="Tahoma" w:eastAsia="Tahoma" w:hAnsi="Tahoma"/>
+                <w:color w:val="B5692B"/>
+                <w:sz w:val="16"/>
+                <w:szCs w:val="16"/>
+              </w:rPr>
+              <w:t xml:space="preserve">•  </w:t>
+            </w:r>
+            <w:r>
+              <w:rPr>
+                <w:rFonts w:ascii="Tahoma" w:cs="Tahoma" w:eastAsia="Tahoma" w:hAnsi="Tahoma"/>
+                <w:sz w:val="16"/>
+                <w:szCs w:val="16"/>
+              </w:rPr>
+              <w:t xml:space="preserve">Pre-assignment (pre-employment) health examinations.</w:t>
+            </w:r>
+          </w:p>
+          <w:p>
+            <w:pPr>
+              <w:spacing w:after="40" w:line="252"/>
+              <w:ind w:left="220" w:hanging="150"/>
+            </w:pPr>
+            <w:r>
+              <w:rPr>
+                <w:rFonts w:ascii="Tahoma" w:cs="Tahoma" w:eastAsia="Tahoma" w:hAnsi="Tahoma"/>
+                <w:color w:val="B5692B"/>
+                <w:sz w:val="16"/>
+                <w:szCs w:val="16"/>
+              </w:rPr>
+              <w:t xml:space="preserve">•  </w:t>
+            </w:r>
+            <w:r>
+              <w:rPr>
+                <w:rFonts w:ascii="Tahoma" w:cs="Tahoma" w:eastAsia="Tahoma" w:hAnsi="Tahoma"/>
+                <w:sz w:val="16"/>
+                <w:szCs w:val="16"/>
+              </w:rPr>
+              <w:t xml:space="preserve">Periodic health examinations.</w:t>
+            </w:r>
+          </w:p>
+          <w:p>
+            <w:pPr>
+              <w:spacing w:after="40" w:line="252"/>
+              <w:ind w:left="220" w:hanging="150"/>
+            </w:pPr>
+            <w:r>
+              <w:rPr>
+                <w:rFonts w:ascii="Tahoma" w:cs="Tahoma" w:eastAsia="Tahoma" w:hAnsi="Tahoma"/>
+                <w:color w:val="B5692B"/>
+                <w:sz w:val="16"/>
+                <w:szCs w:val="16"/>
+              </w:rPr>
+              <w:t xml:space="preserve">•  </w:t>
+            </w:r>
+            <w:r>
+              <w:rPr>
+                <w:rFonts w:ascii="Tahoma" w:cs="Tahoma" w:eastAsia="Tahoma" w:hAnsi="Tahoma"/>
+                <w:sz w:val="16"/>
+                <w:szCs w:val="16"/>
+              </w:rPr>
+              <w:t xml:space="preserve">Return-to-work health examinations.</w:t>
+            </w:r>
+          </w:p>
+          <w:p>
+            <w:pPr>
+              <w:spacing w:after="40" w:line="252"/>
+              <w:ind w:left="220" w:hanging="150"/>
+            </w:pPr>
+            <w:r>
+              <w:rPr>
+                <w:rFonts w:ascii="Tahoma" w:cs="Tahoma" w:eastAsia="Tahoma" w:hAnsi="Tahoma"/>
+                <w:color w:val="B5692B"/>
+                <w:sz w:val="16"/>
+                <w:szCs w:val="16"/>
+              </w:rPr>
+              <w:t xml:space="preserve">•  </w:t>
+            </w:r>
+            <w:r>
+              <w:rPr>
+                <w:rFonts w:ascii="Tahoma" w:cs="Tahoma" w:eastAsia="Tahoma" w:hAnsi="Tahoma"/>
+                <w:sz w:val="16"/>
+                <w:szCs w:val="16"/>
+              </w:rPr>
+              <w:t xml:space="preserve">General health examinations.</w:t>
+            </w:r>
+          </w:p>
+          <w:p>
+            <w:pPr>
+              <w:spacing w:after="40" w:line="252"/>
+              <w:ind w:left="220" w:hanging="150"/>
+            </w:pPr>
+            <w:r>
+              <w:rPr>
+                <w:rFonts w:ascii="Tahoma" w:cs="Tahoma" w:eastAsia="Tahoma" w:hAnsi="Tahoma"/>
+                <w:color w:val="B5692B"/>
+                <w:sz w:val="16"/>
+                <w:szCs w:val="16"/>
+              </w:rPr>
+              <w:t xml:space="preserve">•  </w:t>
+            </w:r>
+            <w:r>
+              <w:rPr>
+                <w:rFonts w:ascii="Tahoma" w:cs="Tahoma" w:eastAsia="Tahoma" w:hAnsi="Tahoma"/>
+                <w:sz w:val="16"/>
+                <w:szCs w:val="16"/>
+              </w:rPr>
+              <w:t xml:space="preserve">Health examinations at termination or after ending of service</w:t>
+            </w:r>
+          </w:p>
+        </w:tc>
+      </w:tr>
+      <w:tr>
+        <w:tc>
+          <w:tcPr>
+            <w:tcW w:type="dxa" w:w="2600"/>
+            <w:tcBorders>
+              <w:top w:val="single" w:color="BFB3AA" w:sz="4"/>
+              <w:left w:val="single" w:color="BFB3AA" w:sz="4"/>
+              <w:bottom w:val="single" w:color="BFB3AA" w:sz="4"/>
+              <w:right w:val="single" w:color="BFB3AA" w:sz="4"/>
+            </w:tcBorders>
+            <w:tcMar>
+              <w:top w:type="dxa" w:w="60"/>
+              <w:left w:type="dxa" w:w="120"/>
+              <w:bottom w:type="dxa" w:w="60"/>
+              <w:right w:type="dxa" w:w="120"/>
+            </w:tcMar>
+            <w:vAlign w:val="top"/>
+          </w:tcPr>
+          <w:p>
+            <w:r>
+              <w:rPr>
+                <w:rFonts w:ascii="Tahoma" w:cs="Tahoma" w:eastAsia="Tahoma" w:hAnsi="Tahoma"/>
+                <w:b/>
+                <w:bCs/>
+                <w:color w:val="542A12"/>
+                <w:sz w:val="18"/>
+                <w:szCs w:val="18"/>
+              </w:rPr>
+              <w:t xml:space="preserve">Assessment of health and safety risks</w:t>
+            </w:r>
+          </w:p>
+        </w:tc>
+        <w:tc>
+          <w:tcPr>
+            <w:tcW w:type="dxa" w:w="6760"/>
+            <w:tcBorders>
+              <w:top w:val="single" w:color="BFB3AA" w:sz="4"/>
+              <w:left w:val="single" w:color="BFB3AA" w:sz="4"/>
+              <w:bottom w:val="single" w:color="BFB3AA" w:sz="4"/>
+              <w:right w:val="single" w:color="BFB3AA" w:sz="4"/>
+            </w:tcBorders>
+            <w:tcMar>
+              <w:top w:type="dxa" w:w="60"/>
+              <w:left w:type="dxa" w:w="120"/>
+              <w:bottom w:type="dxa" w:w="60"/>
+              <w:right w:type="dxa" w:w="120"/>
+            </w:tcMar>
+          </w:tcPr>
+          <w:p>
+            <w:pPr>
+              <w:spacing w:after="40" w:line="252"/>
+              <w:ind w:left="220" w:hanging="150"/>
+            </w:pPr>
+            <w:r>
+              <w:rPr>
+                <w:rFonts w:ascii="Tahoma" w:cs="Tahoma" w:eastAsia="Tahoma" w:hAnsi="Tahoma"/>
+                <w:color w:val="B5692B"/>
+                <w:sz w:val="16"/>
+                <w:szCs w:val="16"/>
+              </w:rPr>
+              <w:t xml:space="preserve">•  </w:t>
+            </w:r>
+            <w:r>
+              <w:rPr>
+                <w:rFonts w:ascii="Tahoma" w:cs="Tahoma" w:eastAsia="Tahoma" w:hAnsi="Tahoma"/>
+                <w:sz w:val="16"/>
+                <w:szCs w:val="16"/>
+              </w:rPr>
+              <w:t xml:space="preserve">Identification of occupational health hazards (as a result of surveillances) Identification of workers or groups of workers exposed to specific hazards.</w:t>
+            </w:r>
+          </w:p>
+          <w:p>
+            <w:pPr>
+              <w:spacing w:after="40" w:line="252"/>
+              <w:ind w:left="220" w:hanging="150"/>
+            </w:pPr>
+            <w:r>
+              <w:rPr>
+                <w:rFonts w:ascii="Tahoma" w:cs="Tahoma" w:eastAsia="Tahoma" w:hAnsi="Tahoma"/>
+                <w:color w:val="B5692B"/>
+                <w:sz w:val="16"/>
+                <w:szCs w:val="16"/>
+              </w:rPr>
+              <w:t xml:space="preserve">•  </w:t>
+            </w:r>
+            <w:r>
+              <w:rPr>
+                <w:rFonts w:ascii="Tahoma" w:cs="Tahoma" w:eastAsia="Tahoma" w:hAnsi="Tahoma"/>
+                <w:sz w:val="16"/>
+                <w:szCs w:val="16"/>
+              </w:rPr>
+              <w:t xml:space="preserve">Analysis of the effects of a hazard on workers (ways of entry, type of exposure, threshold limit values, dose-response relationships, adverse health effects, etc).</w:t>
+            </w:r>
+          </w:p>
+          <w:p>
+            <w:pPr>
+              <w:spacing w:after="40" w:line="252"/>
+              <w:ind w:left="220" w:hanging="150"/>
+            </w:pPr>
+            <w:r>
+              <w:rPr>
+                <w:rFonts w:ascii="Tahoma" w:cs="Tahoma" w:eastAsia="Tahoma" w:hAnsi="Tahoma"/>
+                <w:color w:val="B5692B"/>
+                <w:sz w:val="16"/>
+                <w:szCs w:val="16"/>
+              </w:rPr>
+              <w:t xml:space="preserve">•  </w:t>
+            </w:r>
+            <w:r>
+              <w:rPr>
+                <w:rFonts w:ascii="Tahoma" w:cs="Tahoma" w:eastAsia="Tahoma" w:hAnsi="Tahoma"/>
+                <w:sz w:val="16"/>
+                <w:szCs w:val="16"/>
+              </w:rPr>
+              <w:t xml:space="preserve">Determination of intensity (level) and magnitude (volume) of risk.</w:t>
+            </w:r>
+          </w:p>
+          <w:p>
+            <w:pPr>
+              <w:spacing w:after="40" w:line="252"/>
+              <w:ind w:left="220" w:hanging="150"/>
+            </w:pPr>
+            <w:r>
+              <w:rPr>
+                <w:rFonts w:ascii="Tahoma" w:cs="Tahoma" w:eastAsia="Tahoma" w:hAnsi="Tahoma"/>
+                <w:color w:val="B5692B"/>
+                <w:sz w:val="16"/>
+                <w:szCs w:val="16"/>
+              </w:rPr>
+              <w:t xml:space="preserve">•  </w:t>
+            </w:r>
+            <w:r>
+              <w:rPr>
+                <w:rFonts w:ascii="Tahoma" w:cs="Tahoma" w:eastAsia="Tahoma" w:hAnsi="Tahoma"/>
+                <w:sz w:val="16"/>
+                <w:szCs w:val="16"/>
+              </w:rPr>
+              <w:t xml:space="preserve">Identification of workers and groups with special vulnerabilities.</w:t>
+            </w:r>
+          </w:p>
+          <w:p>
+            <w:pPr>
+              <w:spacing w:after="40" w:line="252"/>
+              <w:ind w:left="220" w:hanging="150"/>
+            </w:pPr>
+            <w:r>
+              <w:rPr>
+                <w:rFonts w:ascii="Tahoma" w:cs="Tahoma" w:eastAsia="Tahoma" w:hAnsi="Tahoma"/>
+                <w:color w:val="B5692B"/>
+                <w:sz w:val="16"/>
+                <w:szCs w:val="16"/>
+              </w:rPr>
+              <w:t xml:space="preserve">•  </w:t>
+            </w:r>
+            <w:r>
+              <w:rPr>
+                <w:rFonts w:ascii="Tahoma" w:cs="Tahoma" w:eastAsia="Tahoma" w:hAnsi="Tahoma"/>
+                <w:sz w:val="16"/>
+                <w:szCs w:val="16"/>
+              </w:rPr>
+              <w:t xml:space="preserve">Evaluation of available hazard prevention and control measures.</w:t>
+            </w:r>
+          </w:p>
+          <w:p>
+            <w:pPr>
+              <w:spacing w:after="40" w:line="252"/>
+              <w:ind w:left="220" w:hanging="150"/>
+            </w:pPr>
+            <w:r>
+              <w:rPr>
+                <w:rFonts w:ascii="Tahoma" w:cs="Tahoma" w:eastAsia="Tahoma" w:hAnsi="Tahoma"/>
+                <w:color w:val="B5692B"/>
+                <w:sz w:val="16"/>
+                <w:szCs w:val="16"/>
+              </w:rPr>
+              <w:t xml:space="preserve">•  </w:t>
+            </w:r>
+            <w:r>
+              <w:rPr>
+                <w:rFonts w:ascii="Tahoma" w:cs="Tahoma" w:eastAsia="Tahoma" w:hAnsi="Tahoma"/>
+                <w:sz w:val="16"/>
+                <w:szCs w:val="16"/>
+              </w:rPr>
+              <w:t xml:space="preserve">Drawing conclusions about and making recommendations for the management and control of risks.</w:t>
+            </w:r>
+          </w:p>
+          <w:p>
+            <w:pPr>
+              <w:spacing w:after="40" w:line="252"/>
+              <w:ind w:left="220" w:hanging="150"/>
+            </w:pPr>
+            <w:r>
+              <w:rPr>
+                <w:rFonts w:ascii="Tahoma" w:cs="Tahoma" w:eastAsia="Tahoma" w:hAnsi="Tahoma"/>
+                <w:color w:val="B5692B"/>
+                <w:sz w:val="16"/>
+                <w:szCs w:val="16"/>
+              </w:rPr>
+              <w:t xml:space="preserve">•  </w:t>
+            </w:r>
+            <w:r>
+              <w:rPr>
+                <w:rFonts w:ascii="Tahoma" w:cs="Tahoma" w:eastAsia="Tahoma" w:hAnsi="Tahoma"/>
+                <w:sz w:val="16"/>
+                <w:szCs w:val="16"/>
+              </w:rPr>
+              <w:t xml:space="preserve">Documentation of the findings of the assessment.</w:t>
+            </w:r>
+          </w:p>
+          <w:p>
+            <w:pPr>
+              <w:spacing w:after="40" w:line="252"/>
+              <w:ind w:left="220" w:hanging="150"/>
+            </w:pPr>
+            <w:r>
+              <w:rPr>
+                <w:rFonts w:ascii="Tahoma" w:cs="Tahoma" w:eastAsia="Tahoma" w:hAnsi="Tahoma"/>
+                <w:color w:val="B5692B"/>
+                <w:sz w:val="16"/>
+                <w:szCs w:val="16"/>
+              </w:rPr>
+              <w:t xml:space="preserve">•  </w:t>
+            </w:r>
+            <w:r>
+              <w:rPr>
+                <w:rFonts w:ascii="Tahoma" w:cs="Tahoma" w:eastAsia="Tahoma" w:hAnsi="Tahoma"/>
+                <w:sz w:val="16"/>
+                <w:szCs w:val="16"/>
+              </w:rPr>
+              <w:t xml:space="preserve">Periodic review and, if necessary, reassessment of risks.</w:t>
+            </w:r>
+          </w:p>
+          <w:p>
+            <w:pPr>
+              <w:spacing w:after="40" w:line="252"/>
+              <w:ind w:left="220" w:hanging="150"/>
+            </w:pPr>
+            <w:r>
+              <w:rPr>
+                <w:rFonts w:ascii="Tahoma" w:cs="Tahoma" w:eastAsia="Tahoma" w:hAnsi="Tahoma"/>
+                <w:color w:val="B5692B"/>
+                <w:sz w:val="16"/>
+                <w:szCs w:val="16"/>
+              </w:rPr>
+              <w:t xml:space="preserve">•  </w:t>
+            </w:r>
+            <w:r>
+              <w:rPr>
+                <w:rFonts w:ascii="Tahoma" w:cs="Tahoma" w:eastAsia="Tahoma" w:hAnsi="Tahoma"/>
+                <w:sz w:val="16"/>
+                <w:szCs w:val="16"/>
+              </w:rPr>
+              <w:t xml:space="preserve">Documentation of the results of risk assessments</w:t>
+            </w:r>
+          </w:p>
+        </w:tc>
+      </w:tr>
+      <w:tr>
+        <w:tc>
+          <w:tcPr>
+            <w:tcW w:type="dxa" w:w="2600"/>
+            <w:tcBorders>
+              <w:top w:val="single" w:color="BFB3AA" w:sz="4"/>
+              <w:left w:val="single" w:color="BFB3AA" w:sz="4"/>
+              <w:bottom w:val="single" w:color="BFB3AA" w:sz="4"/>
+              <w:right w:val="single" w:color="BFB3AA" w:sz="4"/>
+            </w:tcBorders>
+            <w:tcMar>
+              <w:top w:type="dxa" w:w="60"/>
+              <w:left w:type="dxa" w:w="120"/>
+              <w:bottom w:type="dxa" w:w="60"/>
+              <w:right w:type="dxa" w:w="120"/>
+            </w:tcMar>
+            <w:vAlign w:val="top"/>
+          </w:tcPr>
+          <w:p>
+            <w:r>
+              <w:rPr>
+                <w:rFonts w:ascii="Tahoma" w:cs="Tahoma" w:eastAsia="Tahoma" w:hAnsi="Tahoma"/>
+                <w:b/>
+                <w:bCs/>
+                <w:color w:val="542A12"/>
+                <w:sz w:val="18"/>
+                <w:szCs w:val="18"/>
+              </w:rPr>
+              <w:t xml:space="preserve">Information and education on risks and advice on need for preventive and control actions</w:t>
+            </w:r>
+          </w:p>
+        </w:tc>
+        <w:tc>
+          <w:tcPr>
+            <w:tcW w:type="dxa" w:w="6760"/>
+            <w:tcBorders>
+              <w:top w:val="single" w:color="BFB3AA" w:sz="4"/>
+              <w:left w:val="single" w:color="BFB3AA" w:sz="4"/>
+              <w:bottom w:val="single" w:color="BFB3AA" w:sz="4"/>
+              <w:right w:val="single" w:color="BFB3AA" w:sz="4"/>
+            </w:tcBorders>
+            <w:tcMar>
+              <w:top w:type="dxa" w:w="60"/>
+              <w:left w:type="dxa" w:w="120"/>
+              <w:bottom w:type="dxa" w:w="60"/>
+              <w:right w:type="dxa" w:w="120"/>
+            </w:tcMar>
+          </w:tcPr>
+          <w:p>
+            <w:pPr>
+              <w:spacing w:after="40" w:line="252"/>
+              <w:ind w:left="220" w:hanging="150"/>
+            </w:pPr>
+            <w:r>
+              <w:rPr>
+                <w:rFonts w:ascii="Tahoma" w:cs="Tahoma" w:eastAsia="Tahoma" w:hAnsi="Tahoma"/>
+                <w:color w:val="B5692B"/>
+                <w:sz w:val="16"/>
+                <w:szCs w:val="16"/>
+              </w:rPr>
+              <w:t xml:space="preserve">•  </w:t>
+            </w:r>
+            <w:r>
+              <w:rPr>
+                <w:rFonts w:ascii="Tahoma" w:cs="Tahoma" w:eastAsia="Tahoma" w:hAnsi="Tahoma"/>
+                <w:sz w:val="16"/>
+                <w:szCs w:val="16"/>
+              </w:rPr>
+              <w:t xml:space="preserve">Ensuring that employers and self-employed persons are aware of their obligation to know the hazards of the workplace and works in question.</w:t>
+            </w:r>
+          </w:p>
+          <w:p>
+            <w:pPr>
+              <w:spacing w:after="40" w:line="252"/>
+              <w:ind w:left="220" w:hanging="150"/>
+            </w:pPr>
+            <w:r>
+              <w:rPr>
+                <w:rFonts w:ascii="Tahoma" w:cs="Tahoma" w:eastAsia="Tahoma" w:hAnsi="Tahoma"/>
+                <w:color w:val="B5692B"/>
+                <w:sz w:val="16"/>
+                <w:szCs w:val="16"/>
+              </w:rPr>
+              <w:t xml:space="preserve">•  </w:t>
+            </w:r>
+            <w:r>
+              <w:rPr>
+                <w:rFonts w:ascii="Tahoma" w:cs="Tahoma" w:eastAsia="Tahoma" w:hAnsi="Tahoma"/>
+                <w:sz w:val="16"/>
+                <w:szCs w:val="16"/>
+              </w:rPr>
+              <w:t xml:space="preserve">Provision of information so that that workers are aware of their right to know about and continuously receive information on hazards related to their own work and the workplace.</w:t>
+            </w:r>
+          </w:p>
+          <w:p>
+            <w:pPr>
+              <w:spacing w:after="40" w:line="252"/>
+              <w:ind w:left="220" w:hanging="150"/>
+            </w:pPr>
+            <w:r>
+              <w:rPr>
+                <w:rFonts w:ascii="Tahoma" w:cs="Tahoma" w:eastAsia="Tahoma" w:hAnsi="Tahoma"/>
+                <w:color w:val="B5692B"/>
+                <w:sz w:val="16"/>
+                <w:szCs w:val="16"/>
+              </w:rPr>
+              <w:t xml:space="preserve">•  </w:t>
+            </w:r>
+            <w:r>
+              <w:rPr>
+                <w:rFonts w:ascii="Tahoma" w:cs="Tahoma" w:eastAsia="Tahoma" w:hAnsi="Tahoma"/>
+                <w:sz w:val="16"/>
+                <w:szCs w:val="16"/>
+              </w:rPr>
+              <w:t xml:space="preserve">Ensuring that employers are aware of their responsibility to train workers in safe and healthy work practices.</w:t>
+            </w:r>
+          </w:p>
+          <w:p>
+            <w:pPr>
+              <w:spacing w:after="40" w:line="252"/>
+              <w:ind w:left="220" w:hanging="150"/>
+            </w:pPr>
+            <w:r>
+              <w:rPr>
+                <w:rFonts w:ascii="Tahoma" w:cs="Tahoma" w:eastAsia="Tahoma" w:hAnsi="Tahoma"/>
+                <w:color w:val="B5692B"/>
+                <w:sz w:val="16"/>
+                <w:szCs w:val="16"/>
+              </w:rPr>
+              <w:t xml:space="preserve">•  </w:t>
+            </w:r>
+            <w:r>
+              <w:rPr>
+                <w:rFonts w:ascii="Tahoma" w:cs="Tahoma" w:eastAsia="Tahoma" w:hAnsi="Tahoma"/>
+                <w:sz w:val="16"/>
+                <w:szCs w:val="16"/>
+              </w:rPr>
+              <w:t xml:space="preserve">Ensuring that workers are aware of their duty to follow safety instructions and safe and healthy work practices.</w:t>
+            </w:r>
+          </w:p>
+          <w:p>
+            <w:pPr>
+              <w:spacing w:after="40" w:line="252"/>
+              <w:ind w:left="220" w:hanging="150"/>
+            </w:pPr>
+            <w:r>
+              <w:rPr>
+                <w:rFonts w:ascii="Tahoma" w:cs="Tahoma" w:eastAsia="Tahoma" w:hAnsi="Tahoma"/>
+                <w:color w:val="B5692B"/>
+                <w:sz w:val="16"/>
+                <w:szCs w:val="16"/>
+              </w:rPr>
+              <w:t xml:space="preserve">•  </w:t>
+            </w:r>
+            <w:r>
+              <w:rPr>
+                <w:rFonts w:ascii="Tahoma" w:cs="Tahoma" w:eastAsia="Tahoma" w:hAnsi="Tahoma"/>
+                <w:sz w:val="16"/>
+                <w:szCs w:val="16"/>
+              </w:rPr>
+              <w:t xml:space="preserve">Ensuring that special legislation is followed with respect to confidential health information on individual workers and informed consent.</w:t>
+            </w:r>
+          </w:p>
+          <w:p>
+            <w:pPr>
+              <w:spacing w:after="40" w:line="252"/>
+              <w:ind w:left="220" w:hanging="150"/>
+            </w:pPr>
+            <w:r>
+              <w:rPr>
+                <w:rFonts w:ascii="Tahoma" w:cs="Tahoma" w:eastAsia="Tahoma" w:hAnsi="Tahoma"/>
+                <w:color w:val="B5692B"/>
+                <w:sz w:val="16"/>
+                <w:szCs w:val="16"/>
+              </w:rPr>
+              <w:t xml:space="preserve">•  </w:t>
+            </w:r>
+            <w:r>
+              <w:rPr>
+                <w:rFonts w:ascii="Tahoma" w:cs="Tahoma" w:eastAsia="Tahoma" w:hAnsi="Tahoma"/>
+                <w:sz w:val="16"/>
+                <w:szCs w:val="16"/>
+              </w:rPr>
+              <w:t xml:space="preserve">Ensuring that advice provided by occupational health personnel is given in a form easily understood by employers and workers.</w:t>
+            </w:r>
+          </w:p>
+        </w:tc>
+      </w:tr>
+      <w:tr>
+        <w:tc>
+          <w:tcPr>
+            <w:tcW w:type="dxa" w:w="2600"/>
+            <w:tcBorders>
+              <w:top w:val="single" w:color="BFB3AA" w:sz="4"/>
+              <w:left w:val="single" w:color="BFB3AA" w:sz="4"/>
+              <w:bottom w:val="single" w:color="BFB3AA" w:sz="4"/>
+              <w:right w:val="single" w:color="BFB3AA" w:sz="4"/>
+            </w:tcBorders>
+            <w:tcMar>
+              <w:top w:type="dxa" w:w="60"/>
+              <w:left w:type="dxa" w:w="120"/>
+              <w:bottom w:type="dxa" w:w="60"/>
+              <w:right w:type="dxa" w:w="120"/>
+            </w:tcMar>
+            <w:vAlign w:val="top"/>
+          </w:tcPr>
+          <w:p>
+            <w:r>
+              <w:rPr>
+                <w:rFonts w:ascii="Tahoma" w:cs="Tahoma" w:eastAsia="Tahoma" w:hAnsi="Tahoma"/>
+                <w:b/>
+                <w:bCs/>
+                <w:color w:val="542A12"/>
+                <w:sz w:val="18"/>
+                <w:szCs w:val="18"/>
+              </w:rPr>
+              <w:t xml:space="preserve">Preventive actions for the management and control of health and safety hazards and risks</w:t>
+            </w:r>
+          </w:p>
+        </w:tc>
+        <w:tc>
+          <w:tcPr>
+            <w:tcW w:type="dxa" w:w="6760"/>
+            <w:tcBorders>
+              <w:top w:val="single" w:color="BFB3AA" w:sz="4"/>
+              <w:left w:val="single" w:color="BFB3AA" w:sz="4"/>
+              <w:bottom w:val="single" w:color="BFB3AA" w:sz="4"/>
+              <w:right w:val="single" w:color="BFB3AA" w:sz="4"/>
+            </w:tcBorders>
+            <w:tcMar>
+              <w:top w:type="dxa" w:w="60"/>
+              <w:left w:type="dxa" w:w="120"/>
+              <w:bottom w:type="dxa" w:w="60"/>
+              <w:right w:type="dxa" w:w="120"/>
+            </w:tcMar>
+          </w:tcPr>
+          <w:p>
+            <w:pPr>
+              <w:spacing w:after="40" w:line="252"/>
+              <w:ind w:left="220" w:hanging="150"/>
+            </w:pPr>
+            <w:r>
+              <w:rPr>
+                <w:rFonts w:ascii="Tahoma" w:cs="Tahoma" w:eastAsia="Tahoma" w:hAnsi="Tahoma"/>
+                <w:color w:val="B5692B"/>
+                <w:sz w:val="16"/>
+                <w:szCs w:val="16"/>
+              </w:rPr>
+              <w:t xml:space="preserve">•  </w:t>
+            </w:r>
+            <w:r>
+              <w:rPr>
+                <w:rFonts w:ascii="Tahoma" w:cs="Tahoma" w:eastAsia="Tahoma" w:hAnsi="Tahoma"/>
+                <w:sz w:val="16"/>
+                <w:szCs w:val="16"/>
+              </w:rPr>
+              <w:t xml:space="preserve">Control of hazards at the source</w:t>
+            </w:r>
+          </w:p>
+          <w:p>
+            <w:pPr>
+              <w:spacing w:after="40" w:line="252"/>
+              <w:ind w:left="220" w:hanging="150"/>
+            </w:pPr>
+            <w:r>
+              <w:rPr>
+                <w:rFonts w:ascii="Tahoma" w:cs="Tahoma" w:eastAsia="Tahoma" w:hAnsi="Tahoma"/>
+                <w:color w:val="B5692B"/>
+                <w:sz w:val="16"/>
+                <w:szCs w:val="16"/>
+              </w:rPr>
+              <w:t xml:space="preserve">•  </w:t>
+            </w:r>
+            <w:r>
+              <w:rPr>
+                <w:rFonts w:ascii="Tahoma" w:cs="Tahoma" w:eastAsia="Tahoma" w:hAnsi="Tahoma"/>
+                <w:sz w:val="16"/>
+                <w:szCs w:val="16"/>
+              </w:rPr>
+              <w:t xml:space="preserve">Ventilation or control technology</w:t>
+            </w:r>
+          </w:p>
+          <w:p>
+            <w:pPr>
+              <w:spacing w:after="40" w:line="252"/>
+              <w:ind w:left="220" w:hanging="150"/>
+            </w:pPr>
+            <w:r>
+              <w:rPr>
+                <w:rFonts w:ascii="Tahoma" w:cs="Tahoma" w:eastAsia="Tahoma" w:hAnsi="Tahoma"/>
+                <w:color w:val="B5692B"/>
+                <w:sz w:val="16"/>
+                <w:szCs w:val="16"/>
+              </w:rPr>
+              <w:t xml:space="preserve">•  </w:t>
+            </w:r>
+            <w:r>
+              <w:rPr>
+                <w:rFonts w:ascii="Tahoma" w:cs="Tahoma" w:eastAsia="Tahoma" w:hAnsi="Tahoma"/>
+                <w:sz w:val="16"/>
+                <w:szCs w:val="16"/>
+              </w:rPr>
+              <w:t xml:space="preserve">Dust control, Ergonomic measures.</w:t>
+            </w:r>
+          </w:p>
+          <w:p>
+            <w:pPr>
+              <w:spacing w:after="40" w:line="252"/>
+              <w:ind w:left="220" w:hanging="150"/>
+            </w:pPr>
+            <w:r>
+              <w:rPr>
+                <w:rFonts w:ascii="Tahoma" w:cs="Tahoma" w:eastAsia="Tahoma" w:hAnsi="Tahoma"/>
+                <w:color w:val="B5692B"/>
+                <w:sz w:val="16"/>
+                <w:szCs w:val="16"/>
+              </w:rPr>
+              <w:t xml:space="preserve">•  </w:t>
+            </w:r>
+            <w:r>
+              <w:rPr>
+                <w:rFonts w:ascii="Tahoma" w:cs="Tahoma" w:eastAsia="Tahoma" w:hAnsi="Tahoma"/>
+                <w:sz w:val="16"/>
+                <w:szCs w:val="16"/>
+              </w:rPr>
+              <w:t xml:space="preserve">Use of personal protective equipment</w:t>
+            </w:r>
+          </w:p>
+          <w:p>
+            <w:pPr>
+              <w:spacing w:after="40" w:line="252"/>
+              <w:ind w:left="220" w:hanging="150"/>
+            </w:pPr>
+            <w:r>
+              <w:rPr>
+                <w:rFonts w:ascii="Tahoma" w:cs="Tahoma" w:eastAsia="Tahoma" w:hAnsi="Tahoma"/>
+                <w:color w:val="B5692B"/>
+                <w:sz w:val="16"/>
+                <w:szCs w:val="16"/>
+              </w:rPr>
+              <w:t xml:space="preserve">•  </w:t>
+            </w:r>
+            <w:r>
+              <w:rPr>
+                <w:rFonts w:ascii="Tahoma" w:cs="Tahoma" w:eastAsia="Tahoma" w:hAnsi="Tahoma"/>
+                <w:sz w:val="16"/>
+                <w:szCs w:val="16"/>
+              </w:rPr>
+              <w:t xml:space="preserve">Regulation of thermal conditions and the like</w:t>
+            </w:r>
+          </w:p>
+        </w:tc>
+      </w:tr>
+      <w:tr>
+        <w:tc>
+          <w:tcPr>
+            <w:tcW w:type="dxa" w:w="2600"/>
+            <w:tcBorders>
+              <w:top w:val="single" w:color="BFB3AA" w:sz="4"/>
+              <w:left w:val="single" w:color="BFB3AA" w:sz="4"/>
+              <w:bottom w:val="single" w:color="BFB3AA" w:sz="4"/>
+              <w:right w:val="single" w:color="BFB3AA" w:sz="4"/>
+            </w:tcBorders>
+            <w:tcMar>
+              <w:top w:type="dxa" w:w="60"/>
+              <w:left w:type="dxa" w:w="120"/>
+              <w:bottom w:type="dxa" w:w="60"/>
+              <w:right w:type="dxa" w:w="120"/>
+            </w:tcMar>
+            <w:vAlign w:val="top"/>
+          </w:tcPr>
+          <w:p>
+            <w:r>
+              <w:rPr>
+                <w:rFonts w:ascii="Tahoma" w:cs="Tahoma" w:eastAsia="Tahoma" w:hAnsi="Tahoma"/>
+                <w:b/>
+                <w:bCs/>
+                <w:color w:val="542A12"/>
+                <w:sz w:val="18"/>
+                <w:szCs w:val="18"/>
+              </w:rPr>
+              <w:t xml:space="preserve">Prevention of accidents</w:t>
+            </w:r>
+          </w:p>
+        </w:tc>
+        <w:tc>
+          <w:tcPr>
+            <w:tcW w:type="dxa" w:w="6760"/>
+            <w:tcBorders>
+              <w:top w:val="single" w:color="BFB3AA" w:sz="4"/>
+              <w:left w:val="single" w:color="BFB3AA" w:sz="4"/>
+              <w:bottom w:val="single" w:color="BFB3AA" w:sz="4"/>
+              <w:right w:val="single" w:color="BFB3AA" w:sz="4"/>
+            </w:tcBorders>
+            <w:tcMar>
+              <w:top w:type="dxa" w:w="60"/>
+              <w:left w:type="dxa" w:w="120"/>
+              <w:bottom w:type="dxa" w:w="60"/>
+              <w:right w:type="dxa" w:w="120"/>
+            </w:tcMar>
+          </w:tcPr>
+          <w:p>
+            <w:pPr>
+              <w:spacing w:after="40" w:line="252"/>
+              <w:ind w:left="220" w:hanging="150"/>
+            </w:pPr>
+            <w:r>
+              <w:rPr>
+                <w:rFonts w:ascii="Tahoma" w:cs="Tahoma" w:eastAsia="Tahoma" w:hAnsi="Tahoma"/>
+                <w:color w:val="B5692B"/>
+                <w:sz w:val="16"/>
+                <w:szCs w:val="16"/>
+              </w:rPr>
+              <w:t xml:space="preserve">•  </w:t>
+            </w:r>
+            <w:r>
+              <w:rPr>
+                <w:rFonts w:ascii="Tahoma" w:cs="Tahoma" w:eastAsia="Tahoma" w:hAnsi="Tahoma"/>
+                <w:sz w:val="16"/>
+                <w:szCs w:val="16"/>
+              </w:rPr>
+              <w:t xml:space="preserve">Safe planning of facilities, machinery, and the like</w:t>
+            </w:r>
+          </w:p>
+          <w:p>
+            <w:pPr>
+              <w:spacing w:after="40" w:line="252"/>
+              <w:ind w:left="220" w:hanging="150"/>
+            </w:pPr>
+            <w:r>
+              <w:rPr>
+                <w:rFonts w:ascii="Tahoma" w:cs="Tahoma" w:eastAsia="Tahoma" w:hAnsi="Tahoma"/>
+                <w:color w:val="B5692B"/>
+                <w:sz w:val="16"/>
+                <w:szCs w:val="16"/>
+              </w:rPr>
+              <w:t xml:space="preserve">•  </w:t>
+            </w:r>
+            <w:r>
+              <w:rPr>
+                <w:rFonts w:ascii="Tahoma" w:cs="Tahoma" w:eastAsia="Tahoma" w:hAnsi="Tahoma"/>
+                <w:sz w:val="16"/>
+                <w:szCs w:val="16"/>
+              </w:rPr>
+              <w:t xml:space="preserve">Good housekeeping, order, and cleanliness</w:t>
+            </w:r>
+          </w:p>
+          <w:p>
+            <w:pPr>
+              <w:spacing w:after="40" w:line="252"/>
+              <w:ind w:left="220" w:hanging="150"/>
+            </w:pPr>
+            <w:r>
+              <w:rPr>
+                <w:rFonts w:ascii="Tahoma" w:cs="Tahoma" w:eastAsia="Tahoma" w:hAnsi="Tahoma"/>
+                <w:color w:val="B5692B"/>
+                <w:sz w:val="16"/>
+                <w:szCs w:val="16"/>
+              </w:rPr>
+              <w:t xml:space="preserve">•  </w:t>
+            </w:r>
+            <w:r>
+              <w:rPr>
+                <w:rFonts w:ascii="Tahoma" w:cs="Tahoma" w:eastAsia="Tahoma" w:hAnsi="Tahoma"/>
+                <w:sz w:val="16"/>
+                <w:szCs w:val="16"/>
+              </w:rPr>
+              <w:t xml:space="preserve">Construction of walkways and other structures safe (eg, scaffolds, fences) Guarding dangerous machines</w:t>
+            </w:r>
+          </w:p>
+          <w:p>
+            <w:pPr>
+              <w:spacing w:after="40" w:line="252"/>
+              <w:ind w:left="220" w:hanging="150"/>
+            </w:pPr>
+            <w:r>
+              <w:rPr>
+                <w:rFonts w:ascii="Tahoma" w:cs="Tahoma" w:eastAsia="Tahoma" w:hAnsi="Tahoma"/>
+                <w:color w:val="B5692B"/>
+                <w:sz w:val="16"/>
+                <w:szCs w:val="16"/>
+              </w:rPr>
+              <w:t xml:space="preserve">•  </w:t>
+            </w:r>
+            <w:r>
+              <w:rPr>
+                <w:rFonts w:ascii="Tahoma" w:cs="Tahoma" w:eastAsia="Tahoma" w:hAnsi="Tahoma"/>
+                <w:sz w:val="16"/>
+                <w:szCs w:val="16"/>
+              </w:rPr>
+              <w:t xml:space="preserve">Technical aids for moving and lifting heavy loads.</w:t>
+            </w:r>
+          </w:p>
+          <w:p>
+            <w:pPr>
+              <w:spacing w:after="40" w:line="252"/>
+              <w:ind w:left="220" w:hanging="150"/>
+            </w:pPr>
+            <w:r>
+              <w:rPr>
+                <w:rFonts w:ascii="Tahoma" w:cs="Tahoma" w:eastAsia="Tahoma" w:hAnsi="Tahoma"/>
+                <w:color w:val="B5692B"/>
+                <w:sz w:val="16"/>
+                <w:szCs w:val="16"/>
+              </w:rPr>
+              <w:t xml:space="preserve">•  </w:t>
+            </w:r>
+            <w:r>
+              <w:rPr>
+                <w:rFonts w:ascii="Tahoma" w:cs="Tahoma" w:eastAsia="Tahoma" w:hAnsi="Tahoma"/>
+                <w:sz w:val="16"/>
+                <w:szCs w:val="16"/>
+              </w:rPr>
+              <w:t xml:space="preserve">Safe tools and safety equipment for workers</w:t>
+            </w:r>
+          </w:p>
+          <w:p>
+            <w:pPr>
+              <w:spacing w:after="40" w:line="252"/>
+              <w:ind w:left="220" w:hanging="150"/>
+            </w:pPr>
+            <w:r>
+              <w:rPr>
+                <w:rFonts w:ascii="Tahoma" w:cs="Tahoma" w:eastAsia="Tahoma" w:hAnsi="Tahoma"/>
+                <w:color w:val="B5692B"/>
+                <w:sz w:val="16"/>
+                <w:szCs w:val="16"/>
+              </w:rPr>
+              <w:t xml:space="preserve">•  </w:t>
+            </w:r>
+            <w:r>
+              <w:rPr>
+                <w:rFonts w:ascii="Tahoma" w:cs="Tahoma" w:eastAsia="Tahoma" w:hAnsi="Tahoma"/>
+                <w:sz w:val="16"/>
+                <w:szCs w:val="16"/>
+              </w:rPr>
+              <w:t xml:space="preserve">Analysis of major hazard risks and provision of “redundant safety”</w:t>
+            </w:r>
+          </w:p>
+        </w:tc>
+      </w:tr>
+      <w:tr>
+        <w:tc>
+          <w:tcPr>
+            <w:tcW w:type="dxa" w:w="2600"/>
+            <w:tcBorders>
+              <w:top w:val="single" w:color="BFB3AA" w:sz="4"/>
+              <w:left w:val="single" w:color="BFB3AA" w:sz="4"/>
+              <w:bottom w:val="single" w:color="BFB3AA" w:sz="4"/>
+              <w:right w:val="single" w:color="BFB3AA" w:sz="4"/>
+            </w:tcBorders>
+            <w:tcMar>
+              <w:top w:type="dxa" w:w="60"/>
+              <w:left w:type="dxa" w:w="120"/>
+              <w:bottom w:type="dxa" w:w="60"/>
+              <w:right w:type="dxa" w:w="120"/>
+            </w:tcMar>
+            <w:vAlign w:val="top"/>
+          </w:tcPr>
+          <w:p>
+            <w:r>
+              <w:rPr>
+                <w:rFonts w:ascii="Tahoma" w:cs="Tahoma" w:eastAsia="Tahoma" w:hAnsi="Tahoma"/>
+                <w:b/>
+                <w:bCs/>
+                <w:color w:val="542A12"/>
+                <w:sz w:val="18"/>
+                <w:szCs w:val="18"/>
+              </w:rPr>
+              <w:t xml:space="preserve">Maintaining first-aid preparedness and participation in emergency preparedness</w:t>
+            </w:r>
+          </w:p>
+        </w:tc>
+        <w:tc>
+          <w:tcPr>
+            <w:tcW w:type="dxa" w:w="6760"/>
+            <w:tcBorders>
+              <w:top w:val="single" w:color="BFB3AA" w:sz="4"/>
+              <w:left w:val="single" w:color="BFB3AA" w:sz="4"/>
+              <w:bottom w:val="single" w:color="BFB3AA" w:sz="4"/>
+              <w:right w:val="single" w:color="BFB3AA" w:sz="4"/>
+            </w:tcBorders>
+            <w:tcMar>
+              <w:top w:type="dxa" w:w="60"/>
+              <w:left w:type="dxa" w:w="120"/>
+              <w:bottom w:type="dxa" w:w="60"/>
+              <w:right w:type="dxa" w:w="120"/>
+            </w:tcMar>
+          </w:tcPr>
+          <w:p>
+            <w:pPr>
+              <w:spacing w:after="40" w:line="252"/>
+              <w:ind w:left="220" w:hanging="150"/>
+            </w:pPr>
+            <w:r>
+              <w:rPr>
+                <w:rFonts w:ascii="Tahoma" w:cs="Tahoma" w:eastAsia="Tahoma" w:hAnsi="Tahoma"/>
+                <w:color w:val="B5692B"/>
+                <w:sz w:val="16"/>
+                <w:szCs w:val="16"/>
+              </w:rPr>
+              <w:t xml:space="preserve">•  </w:t>
+            </w:r>
+            <w:r>
+              <w:rPr>
+                <w:rFonts w:ascii="Tahoma" w:cs="Tahoma" w:eastAsia="Tahoma" w:hAnsi="Tahoma"/>
+                <w:sz w:val="16"/>
+                <w:szCs w:val="16"/>
+              </w:rPr>
+              <w:t xml:space="preserve">Provision of first-aid services at the workplace when appropriate</w:t>
+            </w:r>
+          </w:p>
+          <w:p>
+            <w:pPr>
+              <w:spacing w:after="40" w:line="252"/>
+              <w:ind w:left="220" w:hanging="150"/>
+            </w:pPr>
+            <w:r>
+              <w:rPr>
+                <w:rFonts w:ascii="Tahoma" w:cs="Tahoma" w:eastAsia="Tahoma" w:hAnsi="Tahoma"/>
+                <w:color w:val="B5692B"/>
+                <w:sz w:val="16"/>
+                <w:szCs w:val="16"/>
+              </w:rPr>
+              <w:t xml:space="preserve">•  </w:t>
+            </w:r>
+            <w:r>
+              <w:rPr>
+                <w:rFonts w:ascii="Tahoma" w:cs="Tahoma" w:eastAsia="Tahoma" w:hAnsi="Tahoma"/>
+                <w:sz w:val="16"/>
+                <w:szCs w:val="16"/>
+              </w:rPr>
+              <w:t xml:space="preserve">Introduction to and training in first-aid practices for workers and supervisors</w:t>
+            </w:r>
+          </w:p>
+          <w:p>
+            <w:pPr>
+              <w:spacing w:after="40" w:line="252"/>
+              <w:ind w:left="220" w:hanging="150"/>
+            </w:pPr>
+            <w:r>
+              <w:rPr>
+                <w:rFonts w:ascii="Tahoma" w:cs="Tahoma" w:eastAsia="Tahoma" w:hAnsi="Tahoma"/>
+                <w:color w:val="B5692B"/>
+                <w:sz w:val="16"/>
+                <w:szCs w:val="16"/>
+              </w:rPr>
+              <w:t xml:space="preserve">•  </w:t>
+            </w:r>
+            <w:r>
+              <w:rPr>
+                <w:rFonts w:ascii="Tahoma" w:cs="Tahoma" w:eastAsia="Tahoma" w:hAnsi="Tahoma"/>
+                <w:sz w:val="16"/>
+                <w:szCs w:val="16"/>
+              </w:rPr>
+              <w:t xml:space="preserve">Maintenance and periodic inspection of first-aid readiness and facilities</w:t>
+            </w:r>
+          </w:p>
+          <w:p>
+            <w:pPr>
+              <w:spacing w:after="40" w:line="252"/>
+              <w:ind w:left="220" w:hanging="150"/>
+            </w:pPr>
+            <w:r>
+              <w:rPr>
+                <w:rFonts w:ascii="Tahoma" w:cs="Tahoma" w:eastAsia="Tahoma" w:hAnsi="Tahoma"/>
+                <w:color w:val="B5692B"/>
+                <w:sz w:val="16"/>
+                <w:szCs w:val="16"/>
+              </w:rPr>
+              <w:t xml:space="preserve">•  </w:t>
+            </w:r>
+            <w:r>
+              <w:rPr>
+                <w:rFonts w:ascii="Tahoma" w:cs="Tahoma" w:eastAsia="Tahoma" w:hAnsi="Tahoma"/>
+                <w:sz w:val="16"/>
+                <w:szCs w:val="16"/>
+              </w:rPr>
+              <w:t xml:space="preserve">Participation from the health point of view in emergency planning and in organizing the health elements of emergency response</w:t>
+            </w:r>
+          </w:p>
+        </w:tc>
+      </w:tr>
+      <w:tr>
+        <w:tc>
+          <w:tcPr>
+            <w:tcW w:type="dxa" w:w="2600"/>
+            <w:tcBorders>
+              <w:top w:val="single" w:color="BFB3AA" w:sz="4"/>
+              <w:left w:val="single" w:color="BFB3AA" w:sz="4"/>
+              <w:bottom w:val="single" w:color="BFB3AA" w:sz="4"/>
+              <w:right w:val="single" w:color="BFB3AA" w:sz="4"/>
+            </w:tcBorders>
+            <w:tcMar>
+              <w:top w:type="dxa" w:w="60"/>
+              <w:left w:type="dxa" w:w="120"/>
+              <w:bottom w:type="dxa" w:w="60"/>
+              <w:right w:type="dxa" w:w="120"/>
+            </w:tcMar>
+            <w:vAlign w:val="top"/>
+          </w:tcPr>
+          <w:p>
+            <w:r>
+              <w:rPr>
+                <w:rFonts w:ascii="Tahoma" w:cs="Tahoma" w:eastAsia="Tahoma" w:hAnsi="Tahoma"/>
+                <w:b/>
+                <w:bCs/>
+                <w:color w:val="542A12"/>
+                <w:sz w:val="18"/>
+                <w:szCs w:val="18"/>
+              </w:rPr>
+              <w:t xml:space="preserve">Diagnosis of occupational and work-related diseases</w:t>
+            </w:r>
+          </w:p>
+        </w:tc>
+        <w:tc>
+          <w:tcPr>
+            <w:tcW w:type="dxa" w:w="6760"/>
+            <w:tcBorders>
+              <w:top w:val="single" w:color="BFB3AA" w:sz="4"/>
+              <w:left w:val="single" w:color="BFB3AA" w:sz="4"/>
+              <w:bottom w:val="single" w:color="BFB3AA" w:sz="4"/>
+              <w:right w:val="single" w:color="BFB3AA" w:sz="4"/>
+            </w:tcBorders>
+            <w:tcMar>
+              <w:top w:type="dxa" w:w="60"/>
+              <w:left w:type="dxa" w:w="120"/>
+              <w:bottom w:type="dxa" w:w="60"/>
+              <w:right w:type="dxa" w:w="120"/>
+            </w:tcMar>
+          </w:tcPr>
+          <w:p>
+            <w:pPr>
+              <w:spacing w:after="40" w:line="252"/>
+              <w:ind w:left="220" w:hanging="150"/>
+            </w:pPr>
+            <w:r>
+              <w:rPr>
+                <w:rFonts w:ascii="Tahoma" w:cs="Tahoma" w:eastAsia="Tahoma" w:hAnsi="Tahoma"/>
+                <w:color w:val="B5692B"/>
+                <w:sz w:val="16"/>
+                <w:szCs w:val="16"/>
+              </w:rPr>
+              <w:t xml:space="preserve">•  </w:t>
+            </w:r>
+            <w:r>
+              <w:rPr>
+                <w:rFonts w:ascii="Tahoma" w:cs="Tahoma" w:eastAsia="Tahoma" w:hAnsi="Tahoma"/>
+                <w:sz w:val="16"/>
+                <w:szCs w:val="16"/>
+              </w:rPr>
+              <w:t xml:space="preserve">Identification of exposure that may cause the disease.</w:t>
+            </w:r>
+          </w:p>
+          <w:p>
+            <w:pPr>
+              <w:spacing w:after="40" w:line="252"/>
+              <w:ind w:left="220" w:hanging="150"/>
+            </w:pPr>
+            <w:r>
+              <w:rPr>
+                <w:rFonts w:ascii="Tahoma" w:cs="Tahoma" w:eastAsia="Tahoma" w:hAnsi="Tahoma"/>
+                <w:color w:val="B5692B"/>
+                <w:sz w:val="16"/>
+                <w:szCs w:val="16"/>
+              </w:rPr>
+              <w:t xml:space="preserve">•  </w:t>
+            </w:r>
+            <w:r>
+              <w:rPr>
+                <w:rFonts w:ascii="Tahoma" w:cs="Tahoma" w:eastAsia="Tahoma" w:hAnsi="Tahoma"/>
+                <w:sz w:val="16"/>
+                <w:szCs w:val="16"/>
+              </w:rPr>
+              <w:t xml:space="preserve">Examination of clinical findings known to be associated with the specific exposure.</w:t>
+            </w:r>
+          </w:p>
+          <w:p>
+            <w:pPr>
+              <w:spacing w:after="40" w:line="252"/>
+              <w:ind w:left="220" w:hanging="150"/>
+            </w:pPr>
+            <w:r>
+              <w:rPr>
+                <w:rFonts w:ascii="Tahoma" w:cs="Tahoma" w:eastAsia="Tahoma" w:hAnsi="Tahoma"/>
+                <w:color w:val="B5692B"/>
+                <w:sz w:val="16"/>
+                <w:szCs w:val="16"/>
+              </w:rPr>
+              <w:t xml:space="preserve">•  </w:t>
+            </w:r>
+            <w:r>
+              <w:rPr>
+                <w:rFonts w:ascii="Tahoma" w:cs="Tahoma" w:eastAsia="Tahoma" w:hAnsi="Tahoma"/>
+                <w:sz w:val="16"/>
+                <w:szCs w:val="16"/>
+              </w:rPr>
+              <w:t xml:space="preserve">Exclusion of nonoccupational factors as a possible cause of disease</w:t>
+            </w:r>
+          </w:p>
+          <w:p>
+            <w:pPr>
+              <w:spacing w:after="40" w:line="252"/>
+              <w:ind w:left="220" w:hanging="150"/>
+            </w:pPr>
+            <w:r>
+              <w:rPr>
+                <w:rFonts w:ascii="Tahoma" w:cs="Tahoma" w:eastAsia="Tahoma" w:hAnsi="Tahoma"/>
+                <w:color w:val="B5692B"/>
+                <w:sz w:val="16"/>
+                <w:szCs w:val="16"/>
+              </w:rPr>
+              <w:t xml:space="preserve">•  </w:t>
+            </w:r>
+            <w:r>
+              <w:rPr>
+                <w:rFonts w:ascii="Tahoma" w:cs="Tahoma" w:eastAsia="Tahoma" w:hAnsi="Tahoma"/>
+                <w:sz w:val="16"/>
+                <w:szCs w:val="16"/>
+              </w:rPr>
+              <w:t xml:space="preserve">Conclusion on existence or nonexistence of occupational disease (diagnosis) Statement on occupational disease for workmen's compensation</w:t>
+            </w:r>
+          </w:p>
+          <w:p>
+            <w:pPr>
+              <w:spacing w:after="40" w:line="252"/>
+              <w:ind w:left="220" w:hanging="150"/>
+            </w:pPr>
+            <w:r>
+              <w:rPr>
+                <w:rFonts w:ascii="Tahoma" w:cs="Tahoma" w:eastAsia="Tahoma" w:hAnsi="Tahoma"/>
+                <w:color w:val="B5692B"/>
+                <w:sz w:val="16"/>
+                <w:szCs w:val="16"/>
+              </w:rPr>
+              <w:t xml:space="preserve">•  </w:t>
+            </w:r>
+            <w:r>
+              <w:rPr>
+                <w:rFonts w:ascii="Tahoma" w:cs="Tahoma" w:eastAsia="Tahoma" w:hAnsi="Tahoma"/>
+                <w:sz w:val="16"/>
+                <w:szCs w:val="16"/>
+              </w:rPr>
+              <w:t xml:space="preserve">Proposals for preventive actions to the workplace of the worker in question Notification of occupational diseases to authorities</w:t>
+            </w:r>
+          </w:p>
+        </w:tc>
+      </w:tr>
+      <w:tr>
+        <w:tc>
+          <w:tcPr>
+            <w:tcW w:type="dxa" w:w="2600"/>
+            <w:tcBorders>
+              <w:top w:val="single" w:color="BFB3AA" w:sz="4"/>
+              <w:left w:val="single" w:color="BFB3AA" w:sz="4"/>
+              <w:bottom w:val="single" w:color="BFB3AA" w:sz="4"/>
+              <w:right w:val="single" w:color="BFB3AA" w:sz="4"/>
+            </w:tcBorders>
+            <w:tcMar>
+              <w:top w:type="dxa" w:w="60"/>
+              <w:left w:type="dxa" w:w="120"/>
+              <w:bottom w:type="dxa" w:w="60"/>
+              <w:right w:type="dxa" w:w="120"/>
+            </w:tcMar>
+            <w:vAlign w:val="top"/>
+          </w:tcPr>
+          <w:p>
+            <w:r>
+              <w:rPr>
+                <w:rFonts w:ascii="Tahoma" w:cs="Tahoma" w:eastAsia="Tahoma" w:hAnsi="Tahoma"/>
+                <w:b/>
+                <w:bCs/>
+                <w:color w:val="542A12"/>
+                <w:sz w:val="18"/>
+                <w:szCs w:val="18"/>
+              </w:rPr>
+              <w:t xml:space="preserve">General health care, curative and rehabilitation services</w:t>
+            </w:r>
+          </w:p>
+        </w:tc>
+        <w:tc>
+          <w:tcPr>
+            <w:tcW w:type="dxa" w:w="6760"/>
+            <w:tcBorders>
+              <w:top w:val="single" w:color="BFB3AA" w:sz="4"/>
+              <w:left w:val="single" w:color="BFB3AA" w:sz="4"/>
+              <w:bottom w:val="single" w:color="BFB3AA" w:sz="4"/>
+              <w:right w:val="single" w:color="BFB3AA" w:sz="4"/>
+            </w:tcBorders>
+            <w:tcMar>
+              <w:top w:type="dxa" w:w="60"/>
+              <w:left w:type="dxa" w:w="120"/>
+              <w:bottom w:type="dxa" w:w="60"/>
+              <w:right w:type="dxa" w:w="120"/>
+            </w:tcMar>
+          </w:tcPr>
+          <w:p>
+            <w:pPr>
+              <w:spacing w:after="40" w:line="252"/>
+              <w:ind w:left="220" w:hanging="150"/>
+            </w:pPr>
+            <w:r>
+              <w:rPr>
+                <w:rFonts w:ascii="Tahoma" w:cs="Tahoma" w:eastAsia="Tahoma" w:hAnsi="Tahoma"/>
+                <w:color w:val="B5692B"/>
+                <w:sz w:val="16"/>
+                <w:szCs w:val="16"/>
+              </w:rPr>
+              <w:t xml:space="preserve">•  </w:t>
+            </w:r>
+            <w:r>
+              <w:rPr>
+                <w:rFonts w:ascii="Tahoma" w:cs="Tahoma" w:eastAsia="Tahoma" w:hAnsi="Tahoma"/>
+                <w:sz w:val="16"/>
+                <w:szCs w:val="16"/>
+              </w:rPr>
+              <w:t xml:space="preserve">Immunizations and other preventive measures</w:t>
+            </w:r>
+          </w:p>
+          <w:p>
+            <w:pPr>
+              <w:spacing w:after="40" w:line="252"/>
+              <w:ind w:left="220" w:hanging="150"/>
+            </w:pPr>
+            <w:r>
+              <w:rPr>
+                <w:rFonts w:ascii="Tahoma" w:cs="Tahoma" w:eastAsia="Tahoma" w:hAnsi="Tahoma"/>
+                <w:color w:val="B5692B"/>
+                <w:sz w:val="16"/>
+                <w:szCs w:val="16"/>
+              </w:rPr>
+              <w:t xml:space="preserve">•  </w:t>
+            </w:r>
+            <w:r>
+              <w:rPr>
+                <w:rFonts w:ascii="Tahoma" w:cs="Tahoma" w:eastAsia="Tahoma" w:hAnsi="Tahoma"/>
+                <w:sz w:val="16"/>
+                <w:szCs w:val="16"/>
+              </w:rPr>
+              <w:t xml:space="preserve">Participation in public health actions and programs</w:t>
+            </w:r>
+          </w:p>
+          <w:p>
+            <w:pPr>
+              <w:spacing w:after="40" w:line="252"/>
+              <w:ind w:left="220" w:hanging="150"/>
+            </w:pPr>
+            <w:r>
+              <w:rPr>
+                <w:rFonts w:ascii="Tahoma" w:cs="Tahoma" w:eastAsia="Tahoma" w:hAnsi="Tahoma"/>
+                <w:color w:val="B5692B"/>
+                <w:sz w:val="16"/>
+                <w:szCs w:val="16"/>
+              </w:rPr>
+              <w:t xml:space="preserve">•  </w:t>
+            </w:r>
+            <w:r>
+              <w:rPr>
+                <w:rFonts w:ascii="Tahoma" w:cs="Tahoma" w:eastAsia="Tahoma" w:hAnsi="Tahoma"/>
+                <w:sz w:val="16"/>
+                <w:szCs w:val="16"/>
+              </w:rPr>
+              <w:t xml:space="preserve">General-practitioner level of general health services</w:t>
+            </w:r>
+          </w:p>
+          <w:p>
+            <w:pPr>
+              <w:spacing w:after="40" w:line="252"/>
+              <w:ind w:left="220" w:hanging="150"/>
+            </w:pPr>
+            <w:r>
+              <w:rPr>
+                <w:rFonts w:ascii="Tahoma" w:cs="Tahoma" w:eastAsia="Tahoma" w:hAnsi="Tahoma"/>
+                <w:color w:val="B5692B"/>
+                <w:sz w:val="16"/>
+                <w:szCs w:val="16"/>
+              </w:rPr>
+              <w:t xml:space="preserve">•  </w:t>
+            </w:r>
+            <w:r>
+              <w:rPr>
+                <w:rFonts w:ascii="Tahoma" w:cs="Tahoma" w:eastAsia="Tahoma" w:hAnsi="Tahoma"/>
+                <w:sz w:val="16"/>
+                <w:szCs w:val="16"/>
+              </w:rPr>
+              <w:t xml:space="preserve">Inspection and advice on canteens and sanitary facilities</w:t>
+            </w:r>
+          </w:p>
+          <w:p>
+            <w:pPr>
+              <w:spacing w:after="40" w:line="252"/>
+              <w:ind w:left="220" w:hanging="150"/>
+            </w:pPr>
+            <w:r>
+              <w:rPr>
+                <w:rFonts w:ascii="Tahoma" w:cs="Tahoma" w:eastAsia="Tahoma" w:hAnsi="Tahoma"/>
+                <w:color w:val="B5692B"/>
+                <w:sz w:val="16"/>
+                <w:szCs w:val="16"/>
+              </w:rPr>
+              <w:t xml:space="preserve">•  </w:t>
+            </w:r>
+            <w:r>
+              <w:rPr>
+                <w:rFonts w:ascii="Tahoma" w:cs="Tahoma" w:eastAsia="Tahoma" w:hAnsi="Tahoma"/>
+                <w:sz w:val="16"/>
+                <w:szCs w:val="16"/>
+              </w:rPr>
+              <w:t xml:space="preserve">Advice and education in general hygiene for personnel and the work community General health promotion and introduction of a healthy lifestyle</w:t>
+            </w:r>
+          </w:p>
+          <w:p>
+            <w:pPr>
+              <w:spacing w:after="40" w:line="252"/>
+              <w:ind w:left="220" w:hanging="150"/>
+            </w:pPr>
+            <w:r>
+              <w:rPr>
+                <w:rFonts w:ascii="Tahoma" w:cs="Tahoma" w:eastAsia="Tahoma" w:hAnsi="Tahoma"/>
+                <w:color w:val="B5692B"/>
+                <w:sz w:val="16"/>
+                <w:szCs w:val="16"/>
+              </w:rPr>
+              <w:t xml:space="preserve">•  </w:t>
+            </w:r>
+            <w:r>
+              <w:rPr>
+                <w:rFonts w:ascii="Tahoma" w:cs="Tahoma" w:eastAsia="Tahoma" w:hAnsi="Tahoma"/>
+                <w:sz w:val="16"/>
+                <w:szCs w:val="16"/>
+              </w:rPr>
+              <w:t xml:space="preserve">Rehabilitation and advice on return to work</w:t>
+            </w:r>
+          </w:p>
+        </w:tc>
+      </w:tr>
+      <w:tr>
+        <w:tc>
+          <w:tcPr>
+            <w:tcW w:type="dxa" w:w="2600"/>
+            <w:tcBorders>
+              <w:top w:val="single" w:color="BFB3AA" w:sz="4"/>
+              <w:left w:val="single" w:color="BFB3AA" w:sz="4"/>
+              <w:bottom w:val="single" w:color="BFB3AA" w:sz="4"/>
+              <w:right w:val="single" w:color="BFB3AA" w:sz="4"/>
+            </w:tcBorders>
+            <w:tcMar>
+              <w:top w:type="dxa" w:w="60"/>
+              <w:left w:type="dxa" w:w="120"/>
+              <w:bottom w:type="dxa" w:w="60"/>
+              <w:right w:type="dxa" w:w="120"/>
+            </w:tcMar>
+            <w:vAlign w:val="top"/>
+          </w:tcPr>
+          <w:p>
+            <w:r>
+              <w:rPr>
+                <w:rFonts w:ascii="Tahoma" w:cs="Tahoma" w:eastAsia="Tahoma" w:hAnsi="Tahoma"/>
+                <w:b/>
+                <w:bCs/>
+                <w:color w:val="542A12"/>
+                <w:sz w:val="18"/>
+                <w:szCs w:val="18"/>
+              </w:rPr>
+              <w:t xml:space="preserve">Record keeping</w:t>
+            </w:r>
+          </w:p>
+        </w:tc>
+        <w:tc>
+          <w:tcPr>
+            <w:tcW w:type="dxa" w:w="6760"/>
+            <w:tcBorders>
+              <w:top w:val="single" w:color="BFB3AA" w:sz="4"/>
+              <w:left w:val="single" w:color="BFB3AA" w:sz="4"/>
+              <w:bottom w:val="single" w:color="BFB3AA" w:sz="4"/>
+              <w:right w:val="single" w:color="BFB3AA" w:sz="4"/>
+            </w:tcBorders>
+            <w:tcMar>
+              <w:top w:type="dxa" w:w="60"/>
+              <w:left w:type="dxa" w:w="120"/>
+              <w:bottom w:type="dxa" w:w="60"/>
+              <w:right w:type="dxa" w:w="120"/>
+            </w:tcMar>
+          </w:tcPr>
+          <w:p>
+            <w:pPr>
+              <w:spacing w:after="40" w:line="252"/>
+              <w:ind w:left="220" w:hanging="150"/>
+            </w:pPr>
+            <w:r>
+              <w:rPr>
+                <w:rFonts w:ascii="Tahoma" w:cs="Tahoma" w:eastAsia="Tahoma" w:hAnsi="Tahoma"/>
+                <w:color w:val="B5692B"/>
+                <w:sz w:val="16"/>
+                <w:szCs w:val="16"/>
+              </w:rPr>
+              <w:t xml:space="preserve">•  </w:t>
+            </w:r>
+            <w:r>
+              <w:rPr>
+                <w:rFonts w:ascii="Tahoma" w:cs="Tahoma" w:eastAsia="Tahoma" w:hAnsi="Tahoma"/>
+                <w:sz w:val="16"/>
+                <w:szCs w:val="16"/>
+              </w:rPr>
+              <w:t xml:space="preserve">Maintenance of general health records if workers are treated as patients or health service clients.</w:t>
+            </w:r>
+          </w:p>
+          <w:p>
+            <w:pPr>
+              <w:spacing w:after="40" w:line="252"/>
+              <w:ind w:left="220" w:hanging="150"/>
+            </w:pPr>
+            <w:r>
+              <w:rPr>
+                <w:rFonts w:ascii="Tahoma" w:cs="Tahoma" w:eastAsia="Tahoma" w:hAnsi="Tahoma"/>
+                <w:color w:val="B5692B"/>
+                <w:sz w:val="16"/>
+                <w:szCs w:val="16"/>
+              </w:rPr>
+              <w:t xml:space="preserve">•  </w:t>
+            </w:r>
+            <w:r>
+              <w:rPr>
+                <w:rFonts w:ascii="Tahoma" w:cs="Tahoma" w:eastAsia="Tahoma" w:hAnsi="Tahoma"/>
+                <w:sz w:val="16"/>
+                <w:szCs w:val="16"/>
+              </w:rPr>
+              <w:t xml:space="preserve">Collection of data on surveyed, detected, and measured occupational exposures and risk assessments.</w:t>
+            </w:r>
+          </w:p>
+          <w:p>
+            <w:pPr>
+              <w:spacing w:after="40" w:line="252"/>
+              <w:ind w:left="220" w:hanging="150"/>
+            </w:pPr>
+            <w:r>
+              <w:rPr>
+                <w:rFonts w:ascii="Tahoma" w:cs="Tahoma" w:eastAsia="Tahoma" w:hAnsi="Tahoma"/>
+                <w:color w:val="B5692B"/>
+                <w:sz w:val="16"/>
+                <w:szCs w:val="16"/>
+              </w:rPr>
+              <w:t xml:space="preserve">•  </w:t>
+            </w:r>
+            <w:r>
+              <w:rPr>
+                <w:rFonts w:ascii="Tahoma" w:cs="Tahoma" w:eastAsia="Tahoma" w:hAnsi="Tahoma"/>
+                <w:sz w:val="16"/>
+                <w:szCs w:val="16"/>
+              </w:rPr>
+              <w:t xml:space="preserve">Collection of statistics on occupational diseases and injuries</w:t>
+            </w:r>
+          </w:p>
+          <w:p>
+            <w:pPr>
+              <w:spacing w:after="40" w:line="252"/>
+              <w:ind w:left="220" w:hanging="150"/>
+            </w:pPr>
+            <w:r>
+              <w:rPr>
+                <w:rFonts w:ascii="Tahoma" w:cs="Tahoma" w:eastAsia="Tahoma" w:hAnsi="Tahoma"/>
+                <w:color w:val="B5692B"/>
+                <w:sz w:val="16"/>
+                <w:szCs w:val="16"/>
+              </w:rPr>
+              <w:t xml:space="preserve">•  </w:t>
+            </w:r>
+            <w:r>
+              <w:rPr>
+                <w:rFonts w:ascii="Tahoma" w:cs="Tahoma" w:eastAsia="Tahoma" w:hAnsi="Tahoma"/>
+                <w:sz w:val="16"/>
+                <w:szCs w:val="16"/>
+              </w:rPr>
+              <w:t xml:space="preserve">Collection of data on health examinations</w:t>
+            </w:r>
+          </w:p>
+          <w:p>
+            <w:pPr>
+              <w:spacing w:after="40" w:line="252"/>
+              <w:ind w:left="220" w:hanging="150"/>
+            </w:pPr>
+            <w:r>
+              <w:rPr>
+                <w:rFonts w:ascii="Tahoma" w:cs="Tahoma" w:eastAsia="Tahoma" w:hAnsi="Tahoma"/>
+                <w:color w:val="B5692B"/>
+                <w:sz w:val="16"/>
+                <w:szCs w:val="16"/>
+              </w:rPr>
+              <w:t xml:space="preserve">•  </w:t>
+            </w:r>
+            <w:r>
+              <w:rPr>
+                <w:rFonts w:ascii="Tahoma" w:cs="Tahoma" w:eastAsia="Tahoma" w:hAnsi="Tahoma"/>
+                <w:sz w:val="16"/>
+                <w:szCs w:val="16"/>
+              </w:rPr>
+              <w:t xml:space="preserve">Preparation of documents on proposals for preventive and control measures</w:t>
+            </w:r>
+          </w:p>
+        </w:tc>
+      </w:tr>
+      <w:tr>
+        <w:tc>
+          <w:tcPr>
+            <w:tcW w:type="dxa" w:w="2600"/>
+            <w:tcBorders>
+              <w:top w:val="single" w:color="BFB3AA" w:sz="4"/>
+              <w:left w:val="single" w:color="BFB3AA" w:sz="4"/>
+              <w:bottom w:val="single" w:color="BFB3AA" w:sz="4"/>
+              <w:right w:val="single" w:color="BFB3AA" w:sz="4"/>
+            </w:tcBorders>
+            <w:tcMar>
+              <w:top w:type="dxa" w:w="60"/>
+              <w:left w:type="dxa" w:w="120"/>
+              <w:bottom w:type="dxa" w:w="60"/>
+              <w:right w:type="dxa" w:w="120"/>
+            </w:tcMar>
+            <w:vAlign w:val="top"/>
+          </w:tcPr>
+          <w:p>
+            <w:r>
+              <w:rPr>
+                <w:rFonts w:ascii="Tahoma" w:cs="Tahoma" w:eastAsia="Tahoma" w:hAnsi="Tahoma"/>
+                <w:b/>
+                <w:bCs/>
+                <w:color w:val="542A12"/>
+                <w:sz w:val="18"/>
+                <w:szCs w:val="18"/>
+              </w:rPr>
+              <w:t xml:space="preserve">Evaluation</w:t>
+            </w:r>
+          </w:p>
+        </w:tc>
+        <w:tc>
+          <w:tcPr>
+            <w:tcW w:type="dxa" w:w="6760"/>
+            <w:tcBorders>
+              <w:top w:val="single" w:color="BFB3AA" w:sz="4"/>
+              <w:left w:val="single" w:color="BFB3AA" w:sz="4"/>
+              <w:bottom w:val="single" w:color="BFB3AA" w:sz="4"/>
+              <w:right w:val="single" w:color="BFB3AA" w:sz="4"/>
+            </w:tcBorders>
+            <w:tcMar>
+              <w:top w:type="dxa" w:w="60"/>
+              <w:left w:type="dxa" w:w="120"/>
+              <w:bottom w:type="dxa" w:w="60"/>
+              <w:right w:type="dxa" w:w="120"/>
+            </w:tcMar>
+          </w:tcPr>
+          <w:p>
+            <w:pPr>
+              <w:spacing w:after="40" w:line="252"/>
+              <w:ind w:left="220" w:hanging="150"/>
+            </w:pPr>
+            <w:r>
+              <w:rPr>
+                <w:rFonts w:ascii="Tahoma" w:cs="Tahoma" w:eastAsia="Tahoma" w:hAnsi="Tahoma"/>
+                <w:color w:val="B5692B"/>
+                <w:sz w:val="16"/>
+                <w:szCs w:val="16"/>
+              </w:rPr>
+              <w:t xml:space="preserve">•  </w:t>
+            </w:r>
+            <w:r>
+              <w:rPr>
+                <w:rFonts w:ascii="Tahoma" w:cs="Tahoma" w:eastAsia="Tahoma" w:hAnsi="Tahoma"/>
+                <w:sz w:val="16"/>
+                <w:szCs w:val="16"/>
+              </w:rPr>
+              <w:t xml:space="preserve">Self-auditing of content of the services</w:t>
+            </w:r>
+          </w:p>
+          <w:p>
+            <w:pPr>
+              <w:spacing w:after="40" w:line="252"/>
+              <w:ind w:left="220" w:hanging="150"/>
+            </w:pPr>
+            <w:r>
+              <w:rPr>
+                <w:rFonts w:ascii="Tahoma" w:cs="Tahoma" w:eastAsia="Tahoma" w:hAnsi="Tahoma"/>
+                <w:color w:val="B5692B"/>
+                <w:sz w:val="16"/>
+                <w:szCs w:val="16"/>
+              </w:rPr>
+              <w:t xml:space="preserve">•  </w:t>
+            </w:r>
+            <w:r>
+              <w:rPr>
+                <w:rFonts w:ascii="Tahoma" w:cs="Tahoma" w:eastAsia="Tahoma" w:hAnsi="Tahoma"/>
+                <w:sz w:val="16"/>
+                <w:szCs w:val="16"/>
+              </w:rPr>
+              <w:t xml:space="preserve">Analysis of data on work environment surveillance, exposures, results of health examinations, statistics on occupational diseases and accidents</w:t>
+            </w:r>
+          </w:p>
+          <w:p>
+            <w:pPr>
+              <w:spacing w:after="40" w:line="252"/>
+              <w:ind w:left="220" w:hanging="150"/>
+            </w:pPr>
+            <w:r>
+              <w:rPr>
+                <w:rFonts w:ascii="Tahoma" w:cs="Tahoma" w:eastAsia="Tahoma" w:hAnsi="Tahoma"/>
+                <w:color w:val="B5692B"/>
+                <w:sz w:val="16"/>
+                <w:szCs w:val="16"/>
+              </w:rPr>
+              <w:t xml:space="preserve">•  </w:t>
+            </w:r>
+            <w:r>
+              <w:rPr>
+                <w:rFonts w:ascii="Tahoma" w:cs="Tahoma" w:eastAsia="Tahoma" w:hAnsi="Tahoma"/>
+                <w:sz w:val="16"/>
+                <w:szCs w:val="16"/>
+              </w:rPr>
+              <w:t xml:space="preserve">Analysis of trends of key indicators (exposures, accidents, diseases, sickness absenteeism)</w:t>
+            </w:r>
+          </w:p>
+          <w:p>
+            <w:pPr>
+              <w:spacing w:after="40" w:line="252"/>
+              <w:ind w:left="220" w:hanging="150"/>
+            </w:pPr>
+            <w:r>
+              <w:rPr>
+                <w:rFonts w:ascii="Tahoma" w:cs="Tahoma" w:eastAsia="Tahoma" w:hAnsi="Tahoma"/>
+                <w:color w:val="B5692B"/>
+                <w:sz w:val="16"/>
+                <w:szCs w:val="16"/>
+              </w:rPr>
+              <w:t xml:space="preserve">•  </w:t>
+            </w:r>
+            <w:r>
+              <w:rPr>
+                <w:rFonts w:ascii="Tahoma" w:cs="Tahoma" w:eastAsia="Tahoma" w:hAnsi="Tahoma"/>
+                <w:sz w:val="16"/>
+                <w:szCs w:val="16"/>
+              </w:rPr>
+              <w:t xml:space="preserve">Analysis of performance of services (in view of preset objectives)</w:t>
+            </w:r>
+          </w:p>
+          <w:p>
+            <w:pPr>
+              <w:spacing w:after="40" w:line="252"/>
+              <w:ind w:left="220" w:hanging="150"/>
+            </w:pPr>
+            <w:r>
+              <w:rPr>
+                <w:rFonts w:ascii="Tahoma" w:cs="Tahoma" w:eastAsia="Tahoma" w:hAnsi="Tahoma"/>
+                <w:color w:val="B5692B"/>
+                <w:sz w:val="16"/>
+                <w:szCs w:val="16"/>
+              </w:rPr>
+              <w:t xml:space="preserve">•  </w:t>
+            </w:r>
+            <w:r>
+              <w:rPr>
+                <w:rFonts w:ascii="Tahoma" w:cs="Tahoma" w:eastAsia="Tahoma" w:hAnsi="Tahoma"/>
+                <w:sz w:val="16"/>
+                <w:szCs w:val="16"/>
+              </w:rPr>
+              <w:t xml:space="preserve">Identification of needs to modify and develop services</w:t>
+            </w:r>
+          </w:p>
+        </w:tc>
+      </w:tr>
+    </w:tbl>
     <w:p>
       <w:pPr>
         <w:pStyle w:val="Heading1"/>

</xml_diff>